<commit_message>
Added index files for 308, 311, 431, 536
</commit_message>
<xml_diff>
--- a/CPRE308/Project2/project2-report-template.docx
+++ b/CPRE308/Project2/project2-report-template.docx
@@ -1,6 +1,6 @@
 
 <file path=word/document.xml><?xml version="1.0" encoding="utf-8"?>
-<w:document xmlns:wpc="http://schemas.microsoft.com/office/word/2010/wordprocessingCanvas" xmlns:cx="http://schemas.microsoft.com/office/drawing/2014/chartex" xmlns:cx1="http://schemas.microsoft.com/office/drawing/2015/9/8/chartex" xmlns:cx2="http://schemas.microsoft.com/office/drawing/2015/10/21/chartex" xmlns:cx3="http://schemas.microsoft.com/office/drawing/2016/5/9/chartex" xmlns:cx4="http://schemas.microsoft.com/office/drawing/2016/5/10/chartex" xmlns:cx5="http://schemas.microsoft.com/office/drawing/2016/5/11/chartex" xmlns:cx6="http://schemas.microsoft.com/office/drawing/2016/5/12/chartex" xmlns:cx7="http://schemas.microsoft.com/office/drawing/2016/5/13/chartex" xmlns:cx8="http://schemas.microsoft.com/office/drawing/2016/5/14/chartex" xmlns:mc="http://schemas.openxmlformats.org/markup-compatibility/2006" xmlns:aink="http://schemas.microsoft.com/office/drawing/2016/ink" xmlns:am3d="http://schemas.microsoft.com/office/drawing/2017/model3d" xmlns:o="urn:schemas-microsoft-com:office:office" xmlns:r="http://schemas.openxmlformats.org/officeDocument/2006/relationships" xmlns:m="http://schemas.openxmlformats.org/officeDocument/2006/math" xmlns:v="urn:schemas-microsoft-com:vml" xmlns:wp14="http://schemas.microsoft.com/office/word/2010/wordprocessingDrawing" xmlns:wp="http://schemas.openxmlformats.org/drawingml/2006/wordprocessingDrawing" xmlns:w10="urn:schemas-microsoft-com:office:word" xmlns:w="http://schemas.openxmlformats.org/wordprocessingml/2006/main" xmlns:w14="http://schemas.microsoft.com/office/word/2010/wordml" xmlns:w15="http://schemas.microsoft.com/office/word/2012/wordml" xmlns:w16cex="http://schemas.microsoft.com/office/word/2018/wordml/cex" xmlns:w16cid="http://schemas.microsoft.com/office/word/2016/wordml/cid" xmlns:w16="http://schemas.microsoft.com/office/word/2018/wordml" xmlns:w16sdtdh="http://schemas.microsoft.com/office/word/2020/wordml/sdtdatahash" xmlns:w16se="http://schemas.microsoft.com/office/word/2015/wordml/symex" xmlns:wpg="http://schemas.microsoft.com/office/word/2010/wordprocessingGroup" xmlns:wpi="http://schemas.microsoft.com/office/word/2010/wordprocessingInk" xmlns:wne="http://schemas.microsoft.com/office/word/2006/wordml" xmlns:wps="http://schemas.microsoft.com/office/word/2010/wordprocessingShape" mc:Ignorable="w14 w15 w16se w16cid w16 w16cex w16sdtdh wp14">
+<w:document xmlns:wpc="http://schemas.microsoft.com/office/word/2010/wordprocessingCanvas" xmlns:cx="http://schemas.microsoft.com/office/drawing/2014/chartex" xmlns:cx1="http://schemas.microsoft.com/office/drawing/2015/9/8/chartex" xmlns:cx2="http://schemas.microsoft.com/office/drawing/2015/10/21/chartex" xmlns:cx3="http://schemas.microsoft.com/office/drawing/2016/5/9/chartex" xmlns:cx4="http://schemas.microsoft.com/office/drawing/2016/5/10/chartex" xmlns:cx5="http://schemas.microsoft.com/office/drawing/2016/5/11/chartex" xmlns:cx6="http://schemas.microsoft.com/office/drawing/2016/5/12/chartex" xmlns:cx7="http://schemas.microsoft.com/office/drawing/2016/5/13/chartex" xmlns:cx8="http://schemas.microsoft.com/office/drawing/2016/5/14/chartex" xmlns:mc="http://schemas.openxmlformats.org/markup-compatibility/2006" xmlns:aink="http://schemas.microsoft.com/office/drawing/2016/ink" xmlns:am3d="http://schemas.microsoft.com/office/drawing/2017/model3d" xmlns:o="urn:schemas-microsoft-com:office:office" xmlns:oel="http://schemas.microsoft.com/office/2019/extlst" xmlns:r="http://schemas.openxmlformats.org/officeDocument/2006/relationships" xmlns:m="http://schemas.openxmlformats.org/officeDocument/2006/math" xmlns:v="urn:schemas-microsoft-com:vml" xmlns:wp14="http://schemas.microsoft.com/office/word/2010/wordprocessingDrawing" xmlns:wp="http://schemas.openxmlformats.org/drawingml/2006/wordprocessingDrawing" xmlns:w10="urn:schemas-microsoft-com:office:word" xmlns:w="http://schemas.openxmlformats.org/wordprocessingml/2006/main" xmlns:w14="http://schemas.microsoft.com/office/word/2010/wordml" xmlns:w15="http://schemas.microsoft.com/office/word/2012/wordml" xmlns:w16cex="http://schemas.microsoft.com/office/word/2018/wordml/cex" xmlns:w16cid="http://schemas.microsoft.com/office/word/2016/wordml/cid" xmlns:w16="http://schemas.microsoft.com/office/word/2018/wordml" xmlns:w16du="http://schemas.microsoft.com/office/word/2023/wordml/word16du" xmlns:w16sdtdh="http://schemas.microsoft.com/office/word/2020/wordml/sdtdatahash" xmlns:w16sdtfl="http://schemas.microsoft.com/office/word/2024/wordml/sdtformatlock" xmlns:w16se="http://schemas.microsoft.com/office/word/2015/wordml/symex" xmlns:wpg="http://schemas.microsoft.com/office/word/2010/wordprocessingGroup" xmlns:wpi="http://schemas.microsoft.com/office/word/2010/wordprocessingInk" xmlns:wne="http://schemas.microsoft.com/office/word/2006/wordml" xmlns:wps="http://schemas.microsoft.com/office/word/2010/wordprocessingShape" mc:Ignorable="w14 w15 w16se w16cid w16 w16cex w16sdtdh w16sdtfl w16du wp14">
   <w:body>
     <w:p>
       <w:pPr>
@@ -20,6 +20,12 @@
         </w:rPr>
         <w:t>e:</w:t>
       </w:r>
+      <w:r>
+        <w:rPr>
+          <w:rFonts w:ascii="Times New Roman" w:hAnsi="Times New Roman" w:cs="Times New Roman"/>
+        </w:rPr>
+        <w:t xml:space="preserve"> Gurumanie Singh Dhiman</w:t>
+      </w:r>
     </w:p>
     <w:p>
       <w:pPr>
@@ -33,6 +39,12 @@
         </w:rPr>
         <w:t xml:space="preserve">Section: </w:t>
       </w:r>
+      <w:r>
+        <w:rPr>
+          <w:rFonts w:ascii="Times New Roman" w:hAnsi="Times New Roman" w:cs="Times New Roman"/>
+        </w:rPr>
+        <w:t>A</w:t>
+      </w:r>
     </w:p>
     <w:p>
       <w:pPr>
@@ -45,6 +57,24 @@
           <w:rFonts w:ascii="Times New Roman" w:hAnsi="Times New Roman" w:cs="Times New Roman"/>
         </w:rPr>
         <w:t xml:space="preserve">University ID: </w:t>
+      </w:r>
+      <w:r>
+        <w:rPr>
+          <w:rFonts w:ascii="Times New Roman" w:hAnsi="Times New Roman" w:cs="Times New Roman"/>
+        </w:rPr>
+        <w:t>91</w:t>
+      </w:r>
+      <w:r>
+        <w:rPr>
+          <w:rFonts w:ascii="Times New Roman" w:hAnsi="Times New Roman" w:cs="Times New Roman"/>
+        </w:rPr>
+        <w:t>1</w:t>
+      </w:r>
+      <w:r>
+        <w:rPr>
+          <w:rFonts w:ascii="Times New Roman" w:hAnsi="Times New Roman" w:cs="Times New Roman"/>
+        </w:rPr>
+        <w:t>192340</w:t>
       </w:r>
     </w:p>
     <w:p>
@@ -121,118 +151,252 @@
           <w:rFonts w:ascii="Times New Roman" w:hAnsi="Times New Roman" w:cs="Times New Roman"/>
         </w:rPr>
       </w:pPr>
-    </w:p>
-    <w:p>
-      <w:pPr>
-        <w:jc w:val="both"/>
-        <w:rPr>
-          <w:rFonts w:ascii="Times New Roman" w:hAnsi="Times New Roman" w:cs="Times New Roman"/>
-        </w:rPr>
-      </w:pPr>
-    </w:p>
-    <w:p>
-      <w:pPr>
-        <w:jc w:val="both"/>
-        <w:rPr>
-          <w:rFonts w:ascii="Times New Roman" w:hAnsi="Times New Roman" w:cs="Times New Roman"/>
-        </w:rPr>
-      </w:pPr>
-    </w:p>
-    <w:p>
-      <w:pPr>
-        <w:jc w:val="both"/>
-        <w:rPr>
-          <w:rFonts w:ascii="Times New Roman" w:hAnsi="Times New Roman" w:cs="Times New Roman"/>
-        </w:rPr>
-      </w:pPr>
-    </w:p>
-    <w:p>
-      <w:pPr>
-        <w:jc w:val="both"/>
-        <w:rPr>
-          <w:rFonts w:ascii="Times New Roman" w:hAnsi="Times New Roman" w:cs="Times New Roman"/>
-        </w:rPr>
-      </w:pPr>
-    </w:p>
-    <w:p>
-      <w:pPr>
-        <w:jc w:val="both"/>
-        <w:rPr>
-          <w:rFonts w:ascii="Times New Roman" w:hAnsi="Times New Roman" w:cs="Times New Roman"/>
-        </w:rPr>
-      </w:pPr>
-    </w:p>
-    <w:p>
-      <w:pPr>
-        <w:jc w:val="both"/>
-        <w:rPr>
-          <w:rFonts w:ascii="Times New Roman" w:hAnsi="Times New Roman" w:cs="Times New Roman"/>
-        </w:rPr>
-      </w:pPr>
-    </w:p>
-    <w:p>
-      <w:pPr>
-        <w:jc w:val="both"/>
-        <w:rPr>
-          <w:rFonts w:ascii="Times New Roman" w:hAnsi="Times New Roman" w:cs="Times New Roman"/>
-        </w:rPr>
-      </w:pPr>
-    </w:p>
-    <w:p>
-      <w:pPr>
-        <w:jc w:val="both"/>
-        <w:rPr>
-          <w:rFonts w:ascii="Times New Roman" w:hAnsi="Times New Roman" w:cs="Times New Roman"/>
-        </w:rPr>
-      </w:pPr>
-    </w:p>
-    <w:p>
-      <w:pPr>
-        <w:jc w:val="both"/>
-        <w:rPr>
-          <w:rFonts w:ascii="Times New Roman" w:hAnsi="Times New Roman" w:cs="Times New Roman"/>
-        </w:rPr>
-      </w:pPr>
-    </w:p>
-    <w:p>
-      <w:pPr>
-        <w:jc w:val="both"/>
-        <w:rPr>
-          <w:rFonts w:ascii="Times New Roman" w:hAnsi="Times New Roman" w:cs="Times New Roman"/>
-        </w:rPr>
-      </w:pPr>
-    </w:p>
-    <w:p>
-      <w:pPr>
-        <w:jc w:val="both"/>
-        <w:rPr>
-          <w:rFonts w:ascii="Times New Roman" w:hAnsi="Times New Roman" w:cs="Times New Roman"/>
-        </w:rPr>
-      </w:pPr>
-    </w:p>
-    <w:p>
-      <w:pPr>
-        <w:jc w:val="both"/>
-        <w:rPr>
-          <w:rFonts w:ascii="Times New Roman" w:hAnsi="Times New Roman" w:cs="Times New Roman"/>
-        </w:rPr>
-      </w:pPr>
-    </w:p>
-    <w:p>
-      <w:pPr>
-        <w:jc w:val="both"/>
-        <w:rPr>
-          <w:rFonts w:ascii="Times New Roman" w:hAnsi="Times New Roman" w:cs="Times New Roman"/>
-        </w:rPr>
-      </w:pPr>
-    </w:p>
-    <w:p>
-      <w:pPr>
-        <w:jc w:val="both"/>
-        <w:rPr>
-          <w:rFonts w:ascii="Times New Roman" w:hAnsi="Times New Roman" w:cs="Times New Roman"/>
-        </w:rPr>
-      </w:pPr>
+      <w:r>
+        <w:rPr>
+          <w:rFonts w:ascii="Times New Roman" w:hAnsi="Times New Roman" w:cs="Times New Roman"/>
+        </w:rPr>
+        <w:t xml:space="preserve">This lab was actually really fun and insightful. I was able to see first hand just </w:t>
+      </w:r>
+      <w:r>
+        <w:rPr>
+          <w:rFonts w:ascii="Times New Roman" w:hAnsi="Times New Roman" w:cs="Times New Roman"/>
+        </w:rPr>
+        <w:t xml:space="preserve">how performance trade-offs of the fine-grained approach vs the coarse-grained approach. It was nice to implement this and I actually found it quite challenging at first but once I got the basic parts of the code done </w:t>
+      </w:r>
+      <w:r>
+        <w:rPr>
+          <w:rFonts w:ascii="Times New Roman" w:hAnsi="Times New Roman" w:cs="Times New Roman"/>
+        </w:rPr>
+        <w:t>it started making a lot more sense. I am glad we were given weeks for this because it definitely took some time to get this done.</w:t>
+      </w:r>
+      <w:r>
+        <w:rPr>
+          <w:rFonts w:ascii="Times New Roman" w:hAnsi="Times New Roman" w:cs="Times New Roman"/>
+        </w:rPr>
+        <w:t xml:space="preserve"> As for the learning in this project, </w:t>
+      </w:r>
+      <w:r>
+        <w:rPr>
+          <w:rFonts w:ascii="Times New Roman" w:hAnsi="Times New Roman" w:cs="Times New Roman"/>
+        </w:rPr>
+        <w:t xml:space="preserve">the medium-grained approach definitely seems to be the most “balanced” approach where it compromises on specific aspects when compared to the </w:t>
+      </w:r>
+      <w:r>
+        <w:rPr>
+          <w:rFonts w:ascii="Times New Roman" w:hAnsi="Times New Roman" w:cs="Times New Roman"/>
+        </w:rPr>
+        <w:t>fine-grained approach but also gives some upside when compared to the coarse-grained approach.</w:t>
+      </w:r>
+    </w:p>
+    <w:p>
+      <w:pPr>
+        <w:jc w:val="both"/>
+        <w:rPr>
+          <w:rFonts w:ascii="Times New Roman" w:hAnsi="Times New Roman" w:cs="Times New Roman"/>
+        </w:rPr>
+      </w:pPr>
+    </w:p>
+    <w:p>
+      <w:pPr>
+        <w:jc w:val="both"/>
+        <w:rPr>
+          <w:rFonts w:ascii="Times New Roman" w:hAnsi="Times New Roman" w:cs="Times New Roman"/>
+        </w:rPr>
+      </w:pPr>
+    </w:p>
+    <w:p>
+      <w:pPr>
+        <w:jc w:val="both"/>
+        <w:rPr>
+          <w:rFonts w:ascii="Times New Roman" w:hAnsi="Times New Roman" w:cs="Times New Roman"/>
+        </w:rPr>
+      </w:pPr>
+    </w:p>
+    <w:p>
+      <w:pPr>
+        <w:jc w:val="both"/>
+        <w:rPr>
+          <w:rFonts w:ascii="Times New Roman" w:hAnsi="Times New Roman" w:cs="Times New Roman"/>
+        </w:rPr>
+      </w:pPr>
+    </w:p>
+    <w:p>
+      <w:pPr>
+        <w:jc w:val="both"/>
+        <w:rPr>
+          <w:rFonts w:ascii="Times New Roman" w:hAnsi="Times New Roman" w:cs="Times New Roman"/>
+        </w:rPr>
+      </w:pPr>
+    </w:p>
+    <w:p>
+      <w:pPr>
+        <w:jc w:val="both"/>
+        <w:rPr>
+          <w:rFonts w:ascii="Times New Roman" w:hAnsi="Times New Roman" w:cs="Times New Roman"/>
+        </w:rPr>
+      </w:pPr>
+      <w:r>
+        <w:rPr>
+          <w:rFonts w:ascii="Times New Roman" w:hAnsi="Times New Roman" w:cs="Times New Roman"/>
+        </w:rPr>
+        <w:drawing>
+          <wp:inline distT="0" distB="0" distL="0" distR="0" wp14:anchorId="4520D321" wp14:editId="6A17521C">
+            <wp:extent cx="3752850" cy="426720"/>
+            <wp:effectExtent l="0" t="0" r="0" b="5080"/>
+            <wp:docPr id="847360320" name="Picture 1"/>
+            <wp:cNvGraphicFramePr>
+              <a:graphicFrameLocks xmlns:a="http://schemas.openxmlformats.org/drawingml/2006/main" noChangeAspect="1"/>
+            </wp:cNvGraphicFramePr>
+            <a:graphic xmlns:a="http://schemas.openxmlformats.org/drawingml/2006/main">
+              <a:graphicData uri="http://schemas.openxmlformats.org/drawingml/2006/picture">
+                <pic:pic xmlns:pic="http://schemas.openxmlformats.org/drawingml/2006/picture">
+                  <pic:nvPicPr>
+                    <pic:cNvPr id="847360320" name=""/>
+                    <pic:cNvPicPr/>
+                  </pic:nvPicPr>
+                  <pic:blipFill rotWithShape="1">
+                    <a:blip r:embed="rId5"/>
+                    <a:srcRect b="85327"/>
+                    <a:stretch>
+                      <a:fillRect/>
+                    </a:stretch>
+                  </pic:blipFill>
+                  <pic:spPr bwMode="auto">
+                    <a:xfrm>
+                      <a:off x="0" y="0"/>
+                      <a:ext cx="3972828" cy="451733"/>
+                    </a:xfrm>
+                    <a:prstGeom prst="rect">
+                      <a:avLst/>
+                    </a:prstGeom>
+                    <a:ln>
+                      <a:noFill/>
+                    </a:ln>
+                    <a:extLst>
+                      <a:ext uri="{53640926-AAD7-44D8-BBD7-CCE9431645EC}">
+                        <a14:shadowObscured xmlns:a14="http://schemas.microsoft.com/office/drawing/2010/main"/>
+                      </a:ext>
+                    </a:extLst>
+                  </pic:spPr>
+                </pic:pic>
+              </a:graphicData>
+            </a:graphic>
+          </wp:inline>
+        </w:drawing>
+      </w:r>
+    </w:p>
+    <w:p>
+      <w:pPr>
+        <w:jc w:val="both"/>
+        <w:rPr>
+          <w:rFonts w:ascii="Times New Roman" w:hAnsi="Times New Roman" w:cs="Times New Roman"/>
+        </w:rPr>
+      </w:pPr>
+      <w:r>
+        <w:rPr>
+          <w:rFonts w:ascii="Times New Roman" w:hAnsi="Times New Roman" w:cs="Times New Roman"/>
+        </w:rPr>
+        <w:drawing>
+          <wp:inline distT="0" distB="0" distL="0" distR="0" wp14:anchorId="366575BE" wp14:editId="606EED38">
+            <wp:extent cx="3752850" cy="1877361"/>
+            <wp:effectExtent l="0" t="0" r="0" b="2540"/>
+            <wp:docPr id="1865831156" name="Picture 1" descr="A screenshot of a computer program&#10;&#10;AI-generated content may be incorrect."/>
+            <wp:cNvGraphicFramePr>
+              <a:graphicFrameLocks xmlns:a="http://schemas.openxmlformats.org/drawingml/2006/main" noChangeAspect="1"/>
+            </wp:cNvGraphicFramePr>
+            <a:graphic xmlns:a="http://schemas.openxmlformats.org/drawingml/2006/main">
+              <a:graphicData uri="http://schemas.openxmlformats.org/drawingml/2006/picture">
+                <pic:pic xmlns:pic="http://schemas.openxmlformats.org/drawingml/2006/picture">
+                  <pic:nvPicPr>
+                    <pic:cNvPr id="1865831156" name="Picture 1" descr="A screenshot of a computer program&#10;&#10;AI-generated content may be incorrect."/>
+                    <pic:cNvPicPr/>
+                  </pic:nvPicPr>
+                  <pic:blipFill rotWithShape="1">
+                    <a:blip r:embed="rId5"/>
+                    <a:srcRect t="35443"/>
+                    <a:stretch>
+                      <a:fillRect/>
+                    </a:stretch>
+                  </pic:blipFill>
+                  <pic:spPr bwMode="auto">
+                    <a:xfrm>
+                      <a:off x="0" y="0"/>
+                      <a:ext cx="3793612" cy="1897752"/>
+                    </a:xfrm>
+                    <a:prstGeom prst="rect">
+                      <a:avLst/>
+                    </a:prstGeom>
+                    <a:ln>
+                      <a:noFill/>
+                    </a:ln>
+                    <a:extLst>
+                      <a:ext uri="{53640926-AAD7-44D8-BBD7-CCE9431645EC}">
+                        <a14:shadowObscured xmlns:a14="http://schemas.microsoft.com/office/drawing/2010/main"/>
+                      </a:ext>
+                    </a:extLst>
+                  </pic:spPr>
+                </pic:pic>
+              </a:graphicData>
+            </a:graphic>
+          </wp:inline>
+        </w:drawing>
+      </w:r>
+    </w:p>
+    <w:p>
+      <w:pPr>
+        <w:jc w:val="both"/>
+        <w:rPr>
+          <w:rFonts w:ascii="Times New Roman" w:hAnsi="Times New Roman" w:cs="Times New Roman"/>
+        </w:rPr>
+      </w:pPr>
+    </w:p>
+    <w:p>
+      <w:pPr>
+        <w:jc w:val="both"/>
+        <w:rPr>
+          <w:rFonts w:ascii="Times New Roman" w:hAnsi="Times New Roman" w:cs="Times New Roman"/>
+        </w:rPr>
+      </w:pPr>
+      <w:r>
+        <w:rPr>
+          <w:rFonts w:ascii="Times New Roman" w:hAnsi="Times New Roman" w:cs="Times New Roman"/>
+        </w:rPr>
+        <w:drawing>
+          <wp:inline distT="0" distB="0" distL="0" distR="0" wp14:anchorId="16E90338" wp14:editId="7DBDF21E">
+            <wp:extent cx="3752850" cy="1363063"/>
+            <wp:effectExtent l="0" t="0" r="0" b="0"/>
+            <wp:docPr id="53772995" name="Picture 1" descr="A screenshot of a computer screen&#10;&#10;AI-generated content may be incorrect."/>
+            <wp:cNvGraphicFramePr>
+              <a:graphicFrameLocks xmlns:a="http://schemas.openxmlformats.org/drawingml/2006/main" noChangeAspect="1"/>
+            </wp:cNvGraphicFramePr>
+            <a:graphic xmlns:a="http://schemas.openxmlformats.org/drawingml/2006/main">
+              <a:graphicData uri="http://schemas.openxmlformats.org/drawingml/2006/picture">
+                <pic:pic xmlns:pic="http://schemas.openxmlformats.org/drawingml/2006/picture">
+                  <pic:nvPicPr>
+                    <pic:cNvPr id="53772995" name="Picture 1" descr="A screenshot of a computer screen&#10;&#10;AI-generated content may be incorrect."/>
+                    <pic:cNvPicPr/>
+                  </pic:nvPicPr>
+                  <pic:blipFill>
+                    <a:blip r:embed="rId6"/>
+                    <a:stretch>
+                      <a:fillRect/>
+                    </a:stretch>
+                  </pic:blipFill>
+                  <pic:spPr>
+                    <a:xfrm>
+                      <a:off x="0" y="0"/>
+                      <a:ext cx="3799976" cy="1380179"/>
+                    </a:xfrm>
+                    <a:prstGeom prst="rect">
+                      <a:avLst/>
+                    </a:prstGeom>
+                  </pic:spPr>
+                </pic:pic>
+              </a:graphicData>
+            </a:graphic>
+          </wp:inline>
+        </w:drawing>
+      </w:r>
     </w:p>
     <w:p>
       <w:pPr>
@@ -283,80 +447,1271 @@
         <w:jc w:val="both"/>
         <w:rPr>
           <w:rFonts w:ascii="Times New Roman" w:hAnsi="Times New Roman" w:cs="Times New Roman"/>
-        </w:rPr>
-      </w:pPr>
-    </w:p>
-    <w:p>
-      <w:pPr>
-        <w:jc w:val="both"/>
-        <w:rPr>
-          <w:rFonts w:ascii="Times New Roman" w:hAnsi="Times New Roman" w:cs="Times New Roman"/>
-        </w:rPr>
-      </w:pPr>
-    </w:p>
-    <w:p>
-      <w:pPr>
-        <w:jc w:val="both"/>
-        <w:rPr>
-          <w:rFonts w:ascii="Times New Roman" w:hAnsi="Times New Roman" w:cs="Times New Roman"/>
-        </w:rPr>
-      </w:pPr>
-    </w:p>
-    <w:p>
-      <w:pPr>
-        <w:jc w:val="both"/>
-        <w:rPr>
-          <w:rFonts w:ascii="Times New Roman" w:hAnsi="Times New Roman" w:cs="Times New Roman"/>
-        </w:rPr>
-      </w:pPr>
-    </w:p>
-    <w:p>
-      <w:pPr>
-        <w:jc w:val="both"/>
-        <w:rPr>
-          <w:rFonts w:ascii="Times New Roman" w:hAnsi="Times New Roman" w:cs="Times New Roman"/>
-        </w:rPr>
-      </w:pPr>
-    </w:p>
-    <w:p>
-      <w:pPr>
-        <w:jc w:val="both"/>
-        <w:rPr>
-          <w:rFonts w:ascii="Times New Roman" w:hAnsi="Times New Roman" w:cs="Times New Roman"/>
-        </w:rPr>
-      </w:pPr>
-    </w:p>
-    <w:p>
-      <w:pPr>
-        <w:jc w:val="both"/>
-        <w:rPr>
-          <w:rFonts w:ascii="Times New Roman" w:hAnsi="Times New Roman" w:cs="Times New Roman"/>
-        </w:rPr>
-      </w:pPr>
-    </w:p>
-    <w:p>
-      <w:pPr>
-        <w:jc w:val="both"/>
-        <w:rPr>
-          <w:rFonts w:ascii="Times New Roman" w:hAnsi="Times New Roman" w:cs="Times New Roman"/>
-        </w:rPr>
-      </w:pPr>
-    </w:p>
-    <w:p>
-      <w:pPr>
-        <w:jc w:val="both"/>
-        <w:rPr>
-          <w:rFonts w:ascii="Times New Roman" w:hAnsi="Times New Roman" w:cs="Times New Roman"/>
-        </w:rPr>
-      </w:pPr>
-    </w:p>
-    <w:p>
-      <w:pPr>
-        <w:jc w:val="both"/>
-        <w:rPr>
-          <w:rFonts w:ascii="Times New Roman" w:hAnsi="Times New Roman" w:cs="Times New Roman"/>
-        </w:rPr>
-      </w:pPr>
+          <w:b/>
+          <w:bCs/>
+        </w:rPr>
+      </w:pPr>
+      <w:r>
+        <w:rPr>
+          <w:rFonts w:ascii="Times New Roman" w:hAnsi="Times New Roman" w:cs="Times New Roman"/>
+        </w:rPr>
+        <w:lastRenderedPageBreak/>
+        <w:drawing>
+          <wp:anchor distT="0" distB="0" distL="114300" distR="114300" simplePos="0" relativeHeight="251658240" behindDoc="1" locked="0" layoutInCell="1" allowOverlap="1" wp14:anchorId="467B2200" wp14:editId="6F427853">
+            <wp:simplePos x="0" y="0"/>
+            <wp:positionH relativeFrom="column">
+              <wp:posOffset>-880533</wp:posOffset>
+            </wp:positionH>
+            <wp:positionV relativeFrom="paragraph">
+              <wp:posOffset>277707</wp:posOffset>
+            </wp:positionV>
+            <wp:extent cx="7698316" cy="2462080"/>
+            <wp:effectExtent l="0" t="0" r="0" b="1905"/>
+            <wp:wrapNone/>
+            <wp:docPr id="1742787988" name="Picture 1"/>
+            <wp:cNvGraphicFramePr>
+              <a:graphicFrameLocks xmlns:a="http://schemas.openxmlformats.org/drawingml/2006/main" noChangeAspect="1"/>
+            </wp:cNvGraphicFramePr>
+            <a:graphic xmlns:a="http://schemas.openxmlformats.org/drawingml/2006/main">
+              <a:graphicData uri="http://schemas.openxmlformats.org/drawingml/2006/picture">
+                <pic:pic xmlns:pic="http://schemas.openxmlformats.org/drawingml/2006/picture">
+                  <pic:nvPicPr>
+                    <pic:cNvPr id="1742787988" name=""/>
+                    <pic:cNvPicPr/>
+                  </pic:nvPicPr>
+                  <pic:blipFill>
+                    <a:blip r:embed="rId7">
+                      <a:extLst>
+                        <a:ext uri="{28A0092B-C50C-407E-A947-70E740481C1C}">
+                          <a14:useLocalDpi xmlns:a14="http://schemas.microsoft.com/office/drawing/2010/main" val="0"/>
+                        </a:ext>
+                      </a:extLst>
+                    </a:blip>
+                    <a:stretch>
+                      <a:fillRect/>
+                    </a:stretch>
+                  </pic:blipFill>
+                  <pic:spPr>
+                    <a:xfrm>
+                      <a:off x="0" y="0"/>
+                      <a:ext cx="7735671" cy="2474027"/>
+                    </a:xfrm>
+                    <a:prstGeom prst="rect">
+                      <a:avLst/>
+                    </a:prstGeom>
+                  </pic:spPr>
+                </pic:pic>
+              </a:graphicData>
+            </a:graphic>
+            <wp14:sizeRelH relativeFrom="page">
+              <wp14:pctWidth>0</wp14:pctWidth>
+            </wp14:sizeRelH>
+            <wp14:sizeRelV relativeFrom="page">
+              <wp14:pctHeight>0</wp14:pctHeight>
+            </wp14:sizeRelV>
+          </wp:anchor>
+        </w:drawing>
+      </w:r>
+      <w:r>
+        <w:rPr>
+          <w:rFonts w:ascii="Times New Roman" w:hAnsi="Times New Roman" w:cs="Times New Roman"/>
+        </w:rPr>
+        <w:t>Test1 (appserver):</w:t>
+      </w:r>
+      <w:r>
+        <w:rPr>
+          <w:rFonts w:ascii="Times New Roman" w:hAnsi="Times New Roman" w:cs="Times New Roman"/>
+        </w:rPr>
+        <w:tab/>
+      </w:r>
+    </w:p>
+    <w:p>
+      <w:pPr>
+        <w:tabs>
+          <w:tab w:val="left" w:pos="2837"/>
+        </w:tabs>
+        <w:jc w:val="both"/>
+        <w:rPr>
+          <w:rFonts w:ascii="Times New Roman" w:hAnsi="Times New Roman" w:cs="Times New Roman"/>
+        </w:rPr>
+      </w:pPr>
+    </w:p>
+    <w:p>
+      <w:pPr>
+        <w:tabs>
+          <w:tab w:val="left" w:pos="2837"/>
+        </w:tabs>
+        <w:jc w:val="both"/>
+        <w:rPr>
+          <w:rFonts w:ascii="Times New Roman" w:hAnsi="Times New Roman" w:cs="Times New Roman"/>
+        </w:rPr>
+      </w:pPr>
+    </w:p>
+    <w:p>
+      <w:pPr>
+        <w:tabs>
+          <w:tab w:val="left" w:pos="2837"/>
+        </w:tabs>
+        <w:jc w:val="both"/>
+        <w:rPr>
+          <w:rFonts w:ascii="Times New Roman" w:hAnsi="Times New Roman" w:cs="Times New Roman"/>
+        </w:rPr>
+      </w:pPr>
+    </w:p>
+    <w:p>
+      <w:pPr>
+        <w:tabs>
+          <w:tab w:val="left" w:pos="2837"/>
+        </w:tabs>
+        <w:jc w:val="both"/>
+        <w:rPr>
+          <w:rFonts w:ascii="Times New Roman" w:hAnsi="Times New Roman" w:cs="Times New Roman"/>
+        </w:rPr>
+      </w:pPr>
+    </w:p>
+    <w:p>
+      <w:pPr>
+        <w:tabs>
+          <w:tab w:val="left" w:pos="2837"/>
+        </w:tabs>
+        <w:jc w:val="both"/>
+        <w:rPr>
+          <w:rFonts w:ascii="Times New Roman" w:hAnsi="Times New Roman" w:cs="Times New Roman"/>
+        </w:rPr>
+      </w:pPr>
+    </w:p>
+    <w:p>
+      <w:pPr>
+        <w:tabs>
+          <w:tab w:val="left" w:pos="2837"/>
+        </w:tabs>
+        <w:jc w:val="both"/>
+        <w:rPr>
+          <w:rFonts w:ascii="Times New Roman" w:hAnsi="Times New Roman" w:cs="Times New Roman"/>
+        </w:rPr>
+      </w:pPr>
+    </w:p>
+    <w:p>
+      <w:pPr>
+        <w:tabs>
+          <w:tab w:val="left" w:pos="2837"/>
+        </w:tabs>
+        <w:jc w:val="both"/>
+        <w:rPr>
+          <w:rFonts w:ascii="Times New Roman" w:hAnsi="Times New Roman" w:cs="Times New Roman"/>
+        </w:rPr>
+      </w:pPr>
+    </w:p>
+    <w:p>
+      <w:pPr>
+        <w:tabs>
+          <w:tab w:val="left" w:pos="2837"/>
+        </w:tabs>
+        <w:jc w:val="both"/>
+        <w:rPr>
+          <w:rFonts w:ascii="Times New Roman" w:hAnsi="Times New Roman" w:cs="Times New Roman"/>
+        </w:rPr>
+      </w:pPr>
+    </w:p>
+    <w:p>
+      <w:pPr>
+        <w:tabs>
+          <w:tab w:val="left" w:pos="2837"/>
+        </w:tabs>
+        <w:jc w:val="both"/>
+        <w:rPr>
+          <w:rFonts w:ascii="Times New Roman" w:hAnsi="Times New Roman" w:cs="Times New Roman"/>
+        </w:rPr>
+      </w:pPr>
+    </w:p>
+    <w:p>
+      <w:pPr>
+        <w:tabs>
+          <w:tab w:val="left" w:pos="2837"/>
+        </w:tabs>
+        <w:jc w:val="both"/>
+        <w:rPr>
+          <w:rFonts w:ascii="Times New Roman" w:hAnsi="Times New Roman" w:cs="Times New Roman"/>
+        </w:rPr>
+      </w:pPr>
+    </w:p>
+    <w:p>
+      <w:pPr>
+        <w:tabs>
+          <w:tab w:val="left" w:pos="2837"/>
+        </w:tabs>
+        <w:jc w:val="both"/>
+        <w:rPr>
+          <w:rFonts w:ascii="Times New Roman" w:hAnsi="Times New Roman" w:cs="Times New Roman"/>
+        </w:rPr>
+      </w:pPr>
+    </w:p>
+    <w:p>
+      <w:pPr>
+        <w:tabs>
+          <w:tab w:val="left" w:pos="2837"/>
+        </w:tabs>
+        <w:jc w:val="both"/>
+        <w:rPr>
+          <w:rFonts w:ascii="Times New Roman" w:hAnsi="Times New Roman" w:cs="Times New Roman"/>
+        </w:rPr>
+      </w:pPr>
+    </w:p>
+    <w:p>
+      <w:pPr>
+        <w:tabs>
+          <w:tab w:val="left" w:pos="2837"/>
+        </w:tabs>
+        <w:jc w:val="both"/>
+        <w:rPr>
+          <w:rFonts w:ascii="Times New Roman" w:hAnsi="Times New Roman" w:cs="Times New Roman"/>
+        </w:rPr>
+      </w:pPr>
+    </w:p>
+    <w:p>
+      <w:pPr>
+        <w:tabs>
+          <w:tab w:val="left" w:pos="2837"/>
+        </w:tabs>
+        <w:jc w:val="both"/>
+        <w:rPr>
+          <w:rFonts w:ascii="Times New Roman" w:hAnsi="Times New Roman" w:cs="Times New Roman"/>
+        </w:rPr>
+      </w:pPr>
+    </w:p>
+    <w:p>
+      <w:pPr>
+        <w:jc w:val="both"/>
+        <w:rPr>
+          <w:rFonts w:ascii="Times New Roman" w:hAnsi="Times New Roman" w:cs="Times New Roman"/>
+        </w:rPr>
+      </w:pPr>
+    </w:p>
+    <w:p>
+      <w:pPr>
+        <w:jc w:val="both"/>
+        <w:rPr>
+          <w:rFonts w:ascii="Times New Roman" w:hAnsi="Times New Roman" w:cs="Times New Roman"/>
+        </w:rPr>
+      </w:pPr>
+      <w:r>
+        <w:rPr>
+          <w:rFonts w:ascii="Times New Roman" w:hAnsi="Times New Roman" w:cs="Times New Roman"/>
+        </w:rPr>
+        <w:drawing>
+          <wp:anchor distT="0" distB="0" distL="114300" distR="114300" simplePos="0" relativeHeight="251659264" behindDoc="1" locked="0" layoutInCell="1" allowOverlap="1" wp14:anchorId="4DB81984" wp14:editId="491EEA94">
+            <wp:simplePos x="0" y="0"/>
+            <wp:positionH relativeFrom="column">
+              <wp:posOffset>-880533</wp:posOffset>
+            </wp:positionH>
+            <wp:positionV relativeFrom="page">
+              <wp:posOffset>4003040</wp:posOffset>
+            </wp:positionV>
+            <wp:extent cx="7698105" cy="2460823"/>
+            <wp:effectExtent l="0" t="0" r="0" b="3175"/>
+            <wp:wrapNone/>
+            <wp:docPr id="1481007160" name="Picture 1" descr="A screenshot of a computer&#10;&#10;AI-generated content may be incorrect."/>
+            <wp:cNvGraphicFramePr>
+              <a:graphicFrameLocks xmlns:a="http://schemas.openxmlformats.org/drawingml/2006/main" noChangeAspect="1"/>
+            </wp:cNvGraphicFramePr>
+            <a:graphic xmlns:a="http://schemas.openxmlformats.org/drawingml/2006/main">
+              <a:graphicData uri="http://schemas.openxmlformats.org/drawingml/2006/picture">
+                <pic:pic xmlns:pic="http://schemas.openxmlformats.org/drawingml/2006/picture">
+                  <pic:nvPicPr>
+                    <pic:cNvPr id="1481007160" name="Picture 1" descr="A screenshot of a computer&#10;&#10;AI-generated content may be incorrect."/>
+                    <pic:cNvPicPr/>
+                  </pic:nvPicPr>
+                  <pic:blipFill>
+                    <a:blip r:embed="rId8">
+                      <a:extLst>
+                        <a:ext uri="{28A0092B-C50C-407E-A947-70E740481C1C}">
+                          <a14:useLocalDpi xmlns:a14="http://schemas.microsoft.com/office/drawing/2010/main" val="0"/>
+                        </a:ext>
+                      </a:extLst>
+                    </a:blip>
+                    <a:stretch>
+                      <a:fillRect/>
+                    </a:stretch>
+                  </pic:blipFill>
+                  <pic:spPr>
+                    <a:xfrm>
+                      <a:off x="0" y="0"/>
+                      <a:ext cx="7713119" cy="2465622"/>
+                    </a:xfrm>
+                    <a:prstGeom prst="rect">
+                      <a:avLst/>
+                    </a:prstGeom>
+                  </pic:spPr>
+                </pic:pic>
+              </a:graphicData>
+            </a:graphic>
+            <wp14:sizeRelH relativeFrom="page">
+              <wp14:pctWidth>0</wp14:pctWidth>
+            </wp14:sizeRelH>
+            <wp14:sizeRelV relativeFrom="page">
+              <wp14:pctHeight>0</wp14:pctHeight>
+            </wp14:sizeRelV>
+          </wp:anchor>
+        </w:drawing>
+      </w:r>
+      <w:r>
+        <w:rPr>
+          <w:rFonts w:ascii="Times New Roman" w:hAnsi="Times New Roman" w:cs="Times New Roman"/>
+        </w:rPr>
+        <w:t>Test2 (appserver):</w:t>
+      </w:r>
+    </w:p>
+    <w:p>
+      <w:pPr>
+        <w:jc w:val="both"/>
+        <w:rPr>
+          <w:rFonts w:ascii="Times New Roman" w:hAnsi="Times New Roman" w:cs="Times New Roman"/>
+        </w:rPr>
+      </w:pPr>
+    </w:p>
+    <w:p>
+      <w:pPr>
+        <w:jc w:val="both"/>
+        <w:rPr>
+          <w:rFonts w:ascii="Times New Roman" w:hAnsi="Times New Roman" w:cs="Times New Roman"/>
+        </w:rPr>
+      </w:pPr>
+    </w:p>
+    <w:p>
+      <w:pPr>
+        <w:jc w:val="both"/>
+        <w:rPr>
+          <w:rFonts w:ascii="Times New Roman" w:hAnsi="Times New Roman" w:cs="Times New Roman"/>
+        </w:rPr>
+      </w:pPr>
+    </w:p>
+    <w:p>
+      <w:pPr>
+        <w:jc w:val="both"/>
+        <w:rPr>
+          <w:rFonts w:ascii="Times New Roman" w:hAnsi="Times New Roman" w:cs="Times New Roman"/>
+        </w:rPr>
+      </w:pPr>
+    </w:p>
+    <w:p>
+      <w:pPr>
+        <w:jc w:val="both"/>
+        <w:rPr>
+          <w:rFonts w:ascii="Times New Roman" w:hAnsi="Times New Roman" w:cs="Times New Roman"/>
+        </w:rPr>
+      </w:pPr>
+    </w:p>
+    <w:p>
+      <w:pPr>
+        <w:jc w:val="both"/>
+        <w:rPr>
+          <w:rFonts w:ascii="Times New Roman" w:hAnsi="Times New Roman" w:cs="Times New Roman"/>
+        </w:rPr>
+      </w:pPr>
+    </w:p>
+    <w:p>
+      <w:pPr>
+        <w:jc w:val="both"/>
+        <w:rPr>
+          <w:rFonts w:ascii="Times New Roman" w:hAnsi="Times New Roman" w:cs="Times New Roman"/>
+        </w:rPr>
+      </w:pPr>
+    </w:p>
+    <w:p>
+      <w:pPr>
+        <w:jc w:val="both"/>
+        <w:rPr>
+          <w:rFonts w:ascii="Times New Roman" w:hAnsi="Times New Roman" w:cs="Times New Roman"/>
+        </w:rPr>
+      </w:pPr>
+    </w:p>
+    <w:p>
+      <w:pPr>
+        <w:jc w:val="both"/>
+        <w:rPr>
+          <w:rFonts w:ascii="Times New Roman" w:hAnsi="Times New Roman" w:cs="Times New Roman"/>
+        </w:rPr>
+      </w:pPr>
+    </w:p>
+    <w:p>
+      <w:pPr>
+        <w:jc w:val="both"/>
+        <w:rPr>
+          <w:rFonts w:ascii="Times New Roman" w:hAnsi="Times New Roman" w:cs="Times New Roman"/>
+        </w:rPr>
+      </w:pPr>
+    </w:p>
+    <w:p>
+      <w:pPr>
+        <w:jc w:val="both"/>
+        <w:rPr>
+          <w:rFonts w:ascii="Times New Roman" w:hAnsi="Times New Roman" w:cs="Times New Roman"/>
+        </w:rPr>
+      </w:pPr>
+    </w:p>
+    <w:p>
+      <w:pPr>
+        <w:jc w:val="both"/>
+        <w:rPr>
+          <w:rFonts w:ascii="Times New Roman" w:hAnsi="Times New Roman" w:cs="Times New Roman"/>
+        </w:rPr>
+      </w:pPr>
+    </w:p>
+    <w:p>
+      <w:pPr>
+        <w:jc w:val="both"/>
+        <w:rPr>
+          <w:rFonts w:ascii="Times New Roman" w:hAnsi="Times New Roman" w:cs="Times New Roman"/>
+        </w:rPr>
+      </w:pPr>
+    </w:p>
+    <w:p>
+      <w:pPr>
+        <w:jc w:val="both"/>
+        <w:rPr>
+          <w:rFonts w:ascii="Times New Roman" w:hAnsi="Times New Roman" w:cs="Times New Roman"/>
+        </w:rPr>
+      </w:pPr>
+    </w:p>
+    <w:p>
+      <w:pPr>
+        <w:jc w:val="both"/>
+        <w:rPr>
+          <w:rFonts w:ascii="Times New Roman" w:hAnsi="Times New Roman" w:cs="Times New Roman"/>
+        </w:rPr>
+      </w:pPr>
+    </w:p>
+    <w:p>
+      <w:pPr>
+        <w:jc w:val="both"/>
+        <w:rPr>
+          <w:rFonts w:ascii="Times New Roman" w:hAnsi="Times New Roman" w:cs="Times New Roman"/>
+        </w:rPr>
+      </w:pPr>
+      <w:r>
+        <w:rPr>
+          <w:rFonts w:ascii="Times New Roman" w:hAnsi="Times New Roman" w:cs="Times New Roman"/>
+        </w:rPr>
+        <w:drawing>
+          <wp:anchor distT="0" distB="0" distL="114300" distR="114300" simplePos="0" relativeHeight="251660288" behindDoc="1" locked="0" layoutInCell="1" allowOverlap="1" wp14:anchorId="08E768A1" wp14:editId="64A2DF30">
+            <wp:simplePos x="0" y="0"/>
+            <wp:positionH relativeFrom="column">
+              <wp:posOffset>-880534</wp:posOffset>
+            </wp:positionH>
+            <wp:positionV relativeFrom="page">
+              <wp:posOffset>6780107</wp:posOffset>
+            </wp:positionV>
+            <wp:extent cx="7698105" cy="2450892"/>
+            <wp:effectExtent l="0" t="0" r="0" b="635"/>
+            <wp:wrapNone/>
+            <wp:docPr id="1354322294" name="Picture 1" descr="A screenshot of a computer&#10;&#10;AI-generated content may be incorrect."/>
+            <wp:cNvGraphicFramePr>
+              <a:graphicFrameLocks xmlns:a="http://schemas.openxmlformats.org/drawingml/2006/main" noChangeAspect="1"/>
+            </wp:cNvGraphicFramePr>
+            <a:graphic xmlns:a="http://schemas.openxmlformats.org/drawingml/2006/main">
+              <a:graphicData uri="http://schemas.openxmlformats.org/drawingml/2006/picture">
+                <pic:pic xmlns:pic="http://schemas.openxmlformats.org/drawingml/2006/picture">
+                  <pic:nvPicPr>
+                    <pic:cNvPr id="1354322294" name="Picture 1" descr="A screenshot of a computer&#10;&#10;AI-generated content may be incorrect."/>
+                    <pic:cNvPicPr/>
+                  </pic:nvPicPr>
+                  <pic:blipFill>
+                    <a:blip r:embed="rId9">
+                      <a:extLst>
+                        <a:ext uri="{28A0092B-C50C-407E-A947-70E740481C1C}">
+                          <a14:useLocalDpi xmlns:a14="http://schemas.microsoft.com/office/drawing/2010/main" val="0"/>
+                        </a:ext>
+                      </a:extLst>
+                    </a:blip>
+                    <a:stretch>
+                      <a:fillRect/>
+                    </a:stretch>
+                  </pic:blipFill>
+                  <pic:spPr>
+                    <a:xfrm>
+                      <a:off x="0" y="0"/>
+                      <a:ext cx="7785542" cy="2478730"/>
+                    </a:xfrm>
+                    <a:prstGeom prst="rect">
+                      <a:avLst/>
+                    </a:prstGeom>
+                  </pic:spPr>
+                </pic:pic>
+              </a:graphicData>
+            </a:graphic>
+            <wp14:sizeRelH relativeFrom="page">
+              <wp14:pctWidth>0</wp14:pctWidth>
+            </wp14:sizeRelH>
+            <wp14:sizeRelV relativeFrom="page">
+              <wp14:pctHeight>0</wp14:pctHeight>
+            </wp14:sizeRelV>
+          </wp:anchor>
+        </w:drawing>
+      </w:r>
+      <w:r>
+        <w:rPr>
+          <w:rFonts w:ascii="Times New Roman" w:hAnsi="Times New Roman" w:cs="Times New Roman"/>
+        </w:rPr>
+        <w:t>Test3 (appserver):</w:t>
+      </w:r>
+    </w:p>
+    <w:p>
+      <w:pPr>
+        <w:jc w:val="both"/>
+        <w:rPr>
+          <w:rFonts w:ascii="Times New Roman" w:hAnsi="Times New Roman" w:cs="Times New Roman"/>
+        </w:rPr>
+      </w:pPr>
+    </w:p>
+    <w:p>
+      <w:pPr>
+        <w:jc w:val="both"/>
+        <w:rPr>
+          <w:rFonts w:ascii="Times New Roman" w:hAnsi="Times New Roman" w:cs="Times New Roman"/>
+        </w:rPr>
+      </w:pPr>
+    </w:p>
+    <w:p>
+      <w:pPr>
+        <w:jc w:val="both"/>
+        <w:rPr>
+          <w:rFonts w:ascii="Times New Roman" w:hAnsi="Times New Roman" w:cs="Times New Roman"/>
+        </w:rPr>
+      </w:pPr>
+    </w:p>
+    <w:p>
+      <w:pPr>
+        <w:jc w:val="both"/>
+        <w:rPr>
+          <w:rFonts w:ascii="Times New Roman" w:hAnsi="Times New Roman" w:cs="Times New Roman"/>
+        </w:rPr>
+      </w:pPr>
+    </w:p>
+    <w:p>
+      <w:pPr>
+        <w:jc w:val="both"/>
+        <w:rPr>
+          <w:rFonts w:ascii="Times New Roman" w:hAnsi="Times New Roman" w:cs="Times New Roman"/>
+        </w:rPr>
+      </w:pPr>
+    </w:p>
+    <w:p>
+      <w:pPr>
+        <w:jc w:val="both"/>
+        <w:rPr>
+          <w:rFonts w:ascii="Times New Roman" w:hAnsi="Times New Roman" w:cs="Times New Roman"/>
+        </w:rPr>
+      </w:pPr>
+    </w:p>
+    <w:p>
+      <w:pPr>
+        <w:jc w:val="both"/>
+        <w:rPr>
+          <w:rFonts w:ascii="Times New Roman" w:hAnsi="Times New Roman" w:cs="Times New Roman"/>
+        </w:rPr>
+      </w:pPr>
+    </w:p>
+    <w:p>
+      <w:pPr>
+        <w:jc w:val="both"/>
+        <w:rPr>
+          <w:rFonts w:ascii="Times New Roman" w:hAnsi="Times New Roman" w:cs="Times New Roman"/>
+        </w:rPr>
+      </w:pPr>
+    </w:p>
+    <w:p>
+      <w:pPr>
+        <w:jc w:val="both"/>
+        <w:rPr>
+          <w:rFonts w:ascii="Times New Roman" w:hAnsi="Times New Roman" w:cs="Times New Roman"/>
+        </w:rPr>
+      </w:pPr>
+    </w:p>
+    <w:p>
+      <w:pPr>
+        <w:jc w:val="both"/>
+        <w:rPr>
+          <w:rFonts w:ascii="Times New Roman" w:hAnsi="Times New Roman" w:cs="Times New Roman"/>
+        </w:rPr>
+      </w:pPr>
+    </w:p>
+    <w:p>
+      <w:pPr>
+        <w:jc w:val="both"/>
+        <w:rPr>
+          <w:rFonts w:ascii="Times New Roman" w:hAnsi="Times New Roman" w:cs="Times New Roman"/>
+        </w:rPr>
+      </w:pPr>
+    </w:p>
+    <w:p>
+      <w:pPr>
+        <w:jc w:val="both"/>
+        <w:rPr>
+          <w:rFonts w:ascii="Times New Roman" w:hAnsi="Times New Roman" w:cs="Times New Roman"/>
+        </w:rPr>
+      </w:pPr>
+    </w:p>
+    <w:p>
+      <w:pPr>
+        <w:jc w:val="both"/>
+        <w:rPr>
+          <w:rFonts w:ascii="Times New Roman" w:hAnsi="Times New Roman" w:cs="Times New Roman"/>
+        </w:rPr>
+      </w:pPr>
+    </w:p>
+    <w:p>
+      <w:pPr>
+        <w:jc w:val="both"/>
+        <w:rPr>
+          <w:rFonts w:ascii="Times New Roman" w:hAnsi="Times New Roman" w:cs="Times New Roman"/>
+        </w:rPr>
+      </w:pPr>
+      <w:r>
+        <w:rPr>
+          <w:rFonts w:ascii="Times New Roman" w:hAnsi="Times New Roman" w:cs="Times New Roman"/>
+        </w:rPr>
+        <w:lastRenderedPageBreak/>
+        <w:drawing>
+          <wp:anchor distT="0" distB="0" distL="114300" distR="114300" simplePos="0" relativeHeight="251661312" behindDoc="1" locked="0" layoutInCell="1" allowOverlap="1" wp14:anchorId="61EBF1AF" wp14:editId="2976606A">
+            <wp:simplePos x="0" y="0"/>
+            <wp:positionH relativeFrom="column">
+              <wp:posOffset>-880533</wp:posOffset>
+            </wp:positionH>
+            <wp:positionV relativeFrom="page">
+              <wp:posOffset>1165013</wp:posOffset>
+            </wp:positionV>
+            <wp:extent cx="7694506" cy="2439882"/>
+            <wp:effectExtent l="0" t="0" r="1905" b="0"/>
+            <wp:wrapNone/>
+            <wp:docPr id="1719030833" name="Picture 1" descr="A screenshot of a computer&#10;&#10;AI-generated content may be incorrect."/>
+            <wp:cNvGraphicFramePr>
+              <a:graphicFrameLocks xmlns:a="http://schemas.openxmlformats.org/drawingml/2006/main" noChangeAspect="1"/>
+            </wp:cNvGraphicFramePr>
+            <a:graphic xmlns:a="http://schemas.openxmlformats.org/drawingml/2006/main">
+              <a:graphicData uri="http://schemas.openxmlformats.org/drawingml/2006/picture">
+                <pic:pic xmlns:pic="http://schemas.openxmlformats.org/drawingml/2006/picture">
+                  <pic:nvPicPr>
+                    <pic:cNvPr id="1719030833" name="Picture 1" descr="A screenshot of a computer&#10;&#10;AI-generated content may be incorrect."/>
+                    <pic:cNvPicPr/>
+                  </pic:nvPicPr>
+                  <pic:blipFill>
+                    <a:blip r:embed="rId10">
+                      <a:extLst>
+                        <a:ext uri="{28A0092B-C50C-407E-A947-70E740481C1C}">
+                          <a14:useLocalDpi xmlns:a14="http://schemas.microsoft.com/office/drawing/2010/main" val="0"/>
+                        </a:ext>
+                      </a:extLst>
+                    </a:blip>
+                    <a:stretch>
+                      <a:fillRect/>
+                    </a:stretch>
+                  </pic:blipFill>
+                  <pic:spPr>
+                    <a:xfrm>
+                      <a:off x="0" y="0"/>
+                      <a:ext cx="7807202" cy="2475617"/>
+                    </a:xfrm>
+                    <a:prstGeom prst="rect">
+                      <a:avLst/>
+                    </a:prstGeom>
+                  </pic:spPr>
+                </pic:pic>
+              </a:graphicData>
+            </a:graphic>
+            <wp14:sizeRelH relativeFrom="page">
+              <wp14:pctWidth>0</wp14:pctWidth>
+            </wp14:sizeRelH>
+            <wp14:sizeRelV relativeFrom="page">
+              <wp14:pctHeight>0</wp14:pctHeight>
+            </wp14:sizeRelV>
+          </wp:anchor>
+        </w:drawing>
+      </w:r>
+      <w:r>
+        <w:rPr>
+          <w:rFonts w:ascii="Times New Roman" w:hAnsi="Times New Roman" w:cs="Times New Roman"/>
+        </w:rPr>
+        <w:t>Test1 (appserver-coarse):</w:t>
+      </w:r>
+    </w:p>
+    <w:p>
+      <w:pPr>
+        <w:jc w:val="both"/>
+        <w:rPr>
+          <w:rFonts w:ascii="Times New Roman" w:hAnsi="Times New Roman" w:cs="Times New Roman"/>
+        </w:rPr>
+      </w:pPr>
+    </w:p>
+    <w:p>
+      <w:pPr>
+        <w:jc w:val="both"/>
+        <w:rPr>
+          <w:rFonts w:ascii="Times New Roman" w:hAnsi="Times New Roman" w:cs="Times New Roman"/>
+        </w:rPr>
+      </w:pPr>
+    </w:p>
+    <w:p>
+      <w:pPr>
+        <w:jc w:val="both"/>
+        <w:rPr>
+          <w:rFonts w:ascii="Times New Roman" w:hAnsi="Times New Roman" w:cs="Times New Roman"/>
+        </w:rPr>
+      </w:pPr>
+    </w:p>
+    <w:p>
+      <w:pPr>
+        <w:jc w:val="both"/>
+        <w:rPr>
+          <w:rFonts w:ascii="Times New Roman" w:hAnsi="Times New Roman" w:cs="Times New Roman"/>
+        </w:rPr>
+      </w:pPr>
+    </w:p>
+    <w:p>
+      <w:pPr>
+        <w:jc w:val="both"/>
+        <w:rPr>
+          <w:rFonts w:ascii="Times New Roman" w:hAnsi="Times New Roman" w:cs="Times New Roman"/>
+        </w:rPr>
+      </w:pPr>
+    </w:p>
+    <w:p>
+      <w:pPr>
+        <w:jc w:val="both"/>
+        <w:rPr>
+          <w:rFonts w:ascii="Times New Roman" w:hAnsi="Times New Roman" w:cs="Times New Roman"/>
+        </w:rPr>
+      </w:pPr>
+    </w:p>
+    <w:p>
+      <w:pPr>
+        <w:jc w:val="both"/>
+        <w:rPr>
+          <w:rFonts w:ascii="Times New Roman" w:hAnsi="Times New Roman" w:cs="Times New Roman"/>
+        </w:rPr>
+      </w:pPr>
+    </w:p>
+    <w:p>
+      <w:pPr>
+        <w:jc w:val="both"/>
+        <w:rPr>
+          <w:rFonts w:ascii="Times New Roman" w:hAnsi="Times New Roman" w:cs="Times New Roman"/>
+        </w:rPr>
+      </w:pPr>
+    </w:p>
+    <w:p>
+      <w:pPr>
+        <w:jc w:val="both"/>
+        <w:rPr>
+          <w:rFonts w:ascii="Times New Roman" w:hAnsi="Times New Roman" w:cs="Times New Roman"/>
+        </w:rPr>
+      </w:pPr>
+    </w:p>
+    <w:p>
+      <w:pPr>
+        <w:jc w:val="both"/>
+        <w:rPr>
+          <w:rFonts w:ascii="Times New Roman" w:hAnsi="Times New Roman" w:cs="Times New Roman"/>
+        </w:rPr>
+      </w:pPr>
+    </w:p>
+    <w:p>
+      <w:pPr>
+        <w:jc w:val="both"/>
+        <w:rPr>
+          <w:rFonts w:ascii="Times New Roman" w:hAnsi="Times New Roman" w:cs="Times New Roman"/>
+        </w:rPr>
+      </w:pPr>
+    </w:p>
+    <w:p>
+      <w:pPr>
+        <w:jc w:val="both"/>
+        <w:rPr>
+          <w:rFonts w:ascii="Times New Roman" w:hAnsi="Times New Roman" w:cs="Times New Roman"/>
+        </w:rPr>
+      </w:pPr>
+    </w:p>
+    <w:p>
+      <w:pPr>
+        <w:jc w:val="both"/>
+        <w:rPr>
+          <w:rFonts w:ascii="Times New Roman" w:hAnsi="Times New Roman" w:cs="Times New Roman"/>
+        </w:rPr>
+      </w:pPr>
+    </w:p>
+    <w:p>
+      <w:pPr>
+        <w:jc w:val="both"/>
+        <w:rPr>
+          <w:rFonts w:ascii="Times New Roman" w:hAnsi="Times New Roman" w:cs="Times New Roman"/>
+        </w:rPr>
+      </w:pPr>
+    </w:p>
+    <w:p>
+      <w:pPr>
+        <w:jc w:val="both"/>
+        <w:rPr>
+          <w:rFonts w:ascii="Times New Roman" w:hAnsi="Times New Roman" w:cs="Times New Roman"/>
+        </w:rPr>
+      </w:pPr>
+    </w:p>
+    <w:p>
+      <w:pPr>
+        <w:jc w:val="both"/>
+        <w:rPr>
+          <w:rFonts w:ascii="Times New Roman" w:hAnsi="Times New Roman" w:cs="Times New Roman"/>
+        </w:rPr>
+      </w:pPr>
+      <w:r>
+        <w:rPr>
+          <w:rFonts w:ascii="Times New Roman" w:hAnsi="Times New Roman" w:cs="Times New Roman"/>
+        </w:rPr>
+        <w:drawing>
+          <wp:anchor distT="0" distB="0" distL="114300" distR="114300" simplePos="0" relativeHeight="251662336" behindDoc="1" locked="0" layoutInCell="1" allowOverlap="1" wp14:anchorId="59DBC59D" wp14:editId="199CA519">
+            <wp:simplePos x="0" y="0"/>
+            <wp:positionH relativeFrom="column">
+              <wp:posOffset>-880534</wp:posOffset>
+            </wp:positionH>
+            <wp:positionV relativeFrom="paragraph">
+              <wp:posOffset>250613</wp:posOffset>
+            </wp:positionV>
+            <wp:extent cx="7694295" cy="2457078"/>
+            <wp:effectExtent l="0" t="0" r="1905" b="0"/>
+            <wp:wrapNone/>
+            <wp:docPr id="1131299924" name="Picture 1" descr="A screenshot of a computer program&#10;&#10;AI-generated content may be incorrect."/>
+            <wp:cNvGraphicFramePr>
+              <a:graphicFrameLocks xmlns:a="http://schemas.openxmlformats.org/drawingml/2006/main" noChangeAspect="1"/>
+            </wp:cNvGraphicFramePr>
+            <a:graphic xmlns:a="http://schemas.openxmlformats.org/drawingml/2006/main">
+              <a:graphicData uri="http://schemas.openxmlformats.org/drawingml/2006/picture">
+                <pic:pic xmlns:pic="http://schemas.openxmlformats.org/drawingml/2006/picture">
+                  <pic:nvPicPr>
+                    <pic:cNvPr id="1131299924" name="Picture 1" descr="A screenshot of a computer program&#10;&#10;AI-generated content may be incorrect."/>
+                    <pic:cNvPicPr/>
+                  </pic:nvPicPr>
+                  <pic:blipFill>
+                    <a:blip r:embed="rId11">
+                      <a:extLst>
+                        <a:ext uri="{28A0092B-C50C-407E-A947-70E740481C1C}">
+                          <a14:useLocalDpi xmlns:a14="http://schemas.microsoft.com/office/drawing/2010/main" val="0"/>
+                        </a:ext>
+                      </a:extLst>
+                    </a:blip>
+                    <a:stretch>
+                      <a:fillRect/>
+                    </a:stretch>
+                  </pic:blipFill>
+                  <pic:spPr>
+                    <a:xfrm>
+                      <a:off x="0" y="0"/>
+                      <a:ext cx="7755246" cy="2476542"/>
+                    </a:xfrm>
+                    <a:prstGeom prst="rect">
+                      <a:avLst/>
+                    </a:prstGeom>
+                  </pic:spPr>
+                </pic:pic>
+              </a:graphicData>
+            </a:graphic>
+            <wp14:sizeRelH relativeFrom="page">
+              <wp14:pctWidth>0</wp14:pctWidth>
+            </wp14:sizeRelH>
+            <wp14:sizeRelV relativeFrom="page">
+              <wp14:pctHeight>0</wp14:pctHeight>
+            </wp14:sizeRelV>
+          </wp:anchor>
+        </w:drawing>
+      </w:r>
+      <w:r>
+        <w:rPr>
+          <w:rFonts w:ascii="Times New Roman" w:hAnsi="Times New Roman" w:cs="Times New Roman"/>
+        </w:rPr>
+        <w:t>Test2 (appserver-coarse):</w:t>
+      </w:r>
+    </w:p>
+    <w:p>
+      <w:pPr>
+        <w:jc w:val="both"/>
+        <w:rPr>
+          <w:rFonts w:ascii="Times New Roman" w:hAnsi="Times New Roman" w:cs="Times New Roman"/>
+        </w:rPr>
+      </w:pPr>
+    </w:p>
+    <w:p>
+      <w:pPr>
+        <w:jc w:val="both"/>
+        <w:rPr>
+          <w:rFonts w:ascii="Times New Roman" w:hAnsi="Times New Roman" w:cs="Times New Roman"/>
+        </w:rPr>
+      </w:pPr>
+    </w:p>
+    <w:p>
+      <w:pPr>
+        <w:jc w:val="both"/>
+        <w:rPr>
+          <w:rFonts w:ascii="Times New Roman" w:hAnsi="Times New Roman" w:cs="Times New Roman"/>
+        </w:rPr>
+      </w:pPr>
+    </w:p>
+    <w:p>
+      <w:pPr>
+        <w:jc w:val="both"/>
+        <w:rPr>
+          <w:rFonts w:ascii="Times New Roman" w:hAnsi="Times New Roman" w:cs="Times New Roman"/>
+        </w:rPr>
+      </w:pPr>
+    </w:p>
+    <w:p>
+      <w:pPr>
+        <w:jc w:val="both"/>
+        <w:rPr>
+          <w:rFonts w:ascii="Times New Roman" w:hAnsi="Times New Roman" w:cs="Times New Roman"/>
+        </w:rPr>
+      </w:pPr>
+    </w:p>
+    <w:p>
+      <w:pPr>
+        <w:jc w:val="both"/>
+        <w:rPr>
+          <w:rFonts w:ascii="Times New Roman" w:hAnsi="Times New Roman" w:cs="Times New Roman"/>
+        </w:rPr>
+      </w:pPr>
+    </w:p>
+    <w:p>
+      <w:pPr>
+        <w:jc w:val="both"/>
+        <w:rPr>
+          <w:rFonts w:ascii="Times New Roman" w:hAnsi="Times New Roman" w:cs="Times New Roman"/>
+        </w:rPr>
+      </w:pPr>
+    </w:p>
+    <w:p>
+      <w:pPr>
+        <w:jc w:val="both"/>
+        <w:rPr>
+          <w:rFonts w:ascii="Times New Roman" w:hAnsi="Times New Roman" w:cs="Times New Roman"/>
+        </w:rPr>
+      </w:pPr>
+    </w:p>
+    <w:p>
+      <w:pPr>
+        <w:jc w:val="both"/>
+        <w:rPr>
+          <w:rFonts w:ascii="Times New Roman" w:hAnsi="Times New Roman" w:cs="Times New Roman"/>
+        </w:rPr>
+      </w:pPr>
+    </w:p>
+    <w:p>
+      <w:pPr>
+        <w:jc w:val="both"/>
+        <w:rPr>
+          <w:rFonts w:ascii="Times New Roman" w:hAnsi="Times New Roman" w:cs="Times New Roman"/>
+        </w:rPr>
+      </w:pPr>
+    </w:p>
+    <w:p>
+      <w:pPr>
+        <w:jc w:val="both"/>
+        <w:rPr>
+          <w:rFonts w:ascii="Times New Roman" w:hAnsi="Times New Roman" w:cs="Times New Roman"/>
+        </w:rPr>
+      </w:pPr>
+    </w:p>
+    <w:p>
+      <w:pPr>
+        <w:jc w:val="both"/>
+        <w:rPr>
+          <w:rFonts w:ascii="Times New Roman" w:hAnsi="Times New Roman" w:cs="Times New Roman"/>
+        </w:rPr>
+      </w:pPr>
+    </w:p>
+    <w:p>
+      <w:pPr>
+        <w:jc w:val="both"/>
+        <w:rPr>
+          <w:rFonts w:ascii="Times New Roman" w:hAnsi="Times New Roman" w:cs="Times New Roman"/>
+        </w:rPr>
+      </w:pPr>
+    </w:p>
+    <w:p>
+      <w:pPr>
+        <w:jc w:val="both"/>
+        <w:rPr>
+          <w:rFonts w:ascii="Times New Roman" w:hAnsi="Times New Roman" w:cs="Times New Roman"/>
+        </w:rPr>
+      </w:pPr>
+    </w:p>
+    <w:p>
+      <w:pPr>
+        <w:jc w:val="both"/>
+        <w:rPr>
+          <w:rFonts w:ascii="Times New Roman" w:hAnsi="Times New Roman" w:cs="Times New Roman"/>
+        </w:rPr>
+      </w:pPr>
+    </w:p>
+    <w:p>
+      <w:pPr>
+        <w:jc w:val="both"/>
+        <w:rPr>
+          <w:rFonts w:ascii="Times New Roman" w:hAnsi="Times New Roman" w:cs="Times New Roman"/>
+        </w:rPr>
+      </w:pPr>
+      <w:r>
+        <w:rPr>
+          <w:rFonts w:ascii="Times New Roman" w:hAnsi="Times New Roman" w:cs="Times New Roman"/>
+        </w:rPr>
+        <w:drawing>
+          <wp:anchor distT="0" distB="0" distL="114300" distR="114300" simplePos="0" relativeHeight="251663360" behindDoc="1" locked="0" layoutInCell="1" allowOverlap="1" wp14:anchorId="014F0C45" wp14:editId="2D2FB0C1">
+            <wp:simplePos x="0" y="0"/>
+            <wp:positionH relativeFrom="column">
+              <wp:posOffset>-880533</wp:posOffset>
+            </wp:positionH>
+            <wp:positionV relativeFrom="page">
+              <wp:posOffset>6773332</wp:posOffset>
+            </wp:positionV>
+            <wp:extent cx="7694295" cy="2448035"/>
+            <wp:effectExtent l="0" t="0" r="1905" b="3175"/>
+            <wp:wrapNone/>
+            <wp:docPr id="1073594208" name="Picture 1" descr="A screenshot of a computer&#10;&#10;AI-generated content may be incorrect."/>
+            <wp:cNvGraphicFramePr>
+              <a:graphicFrameLocks xmlns:a="http://schemas.openxmlformats.org/drawingml/2006/main" noChangeAspect="1"/>
+            </wp:cNvGraphicFramePr>
+            <a:graphic xmlns:a="http://schemas.openxmlformats.org/drawingml/2006/main">
+              <a:graphicData uri="http://schemas.openxmlformats.org/drawingml/2006/picture">
+                <pic:pic xmlns:pic="http://schemas.openxmlformats.org/drawingml/2006/picture">
+                  <pic:nvPicPr>
+                    <pic:cNvPr id="1073594208" name="Picture 1" descr="A screenshot of a computer&#10;&#10;AI-generated content may be incorrect."/>
+                    <pic:cNvPicPr/>
+                  </pic:nvPicPr>
+                  <pic:blipFill>
+                    <a:blip r:embed="rId12">
+                      <a:extLst>
+                        <a:ext uri="{28A0092B-C50C-407E-A947-70E740481C1C}">
+                          <a14:useLocalDpi xmlns:a14="http://schemas.microsoft.com/office/drawing/2010/main" val="0"/>
+                        </a:ext>
+                      </a:extLst>
+                    </a:blip>
+                    <a:stretch>
+                      <a:fillRect/>
+                    </a:stretch>
+                  </pic:blipFill>
+                  <pic:spPr>
+                    <a:xfrm>
+                      <a:off x="0" y="0"/>
+                      <a:ext cx="7754710" cy="2467257"/>
+                    </a:xfrm>
+                    <a:prstGeom prst="rect">
+                      <a:avLst/>
+                    </a:prstGeom>
+                  </pic:spPr>
+                </pic:pic>
+              </a:graphicData>
+            </a:graphic>
+            <wp14:sizeRelH relativeFrom="page">
+              <wp14:pctWidth>0</wp14:pctWidth>
+            </wp14:sizeRelH>
+            <wp14:sizeRelV relativeFrom="page">
+              <wp14:pctHeight>0</wp14:pctHeight>
+            </wp14:sizeRelV>
+          </wp:anchor>
+        </w:drawing>
+      </w:r>
+      <w:r>
+        <w:rPr>
+          <w:rFonts w:ascii="Times New Roman" w:hAnsi="Times New Roman" w:cs="Times New Roman"/>
+        </w:rPr>
+        <w:t>Test3 (appserver-coarse):</w:t>
+      </w:r>
+    </w:p>
+    <w:p>
+      <w:pPr>
+        <w:jc w:val="both"/>
+        <w:rPr>
+          <w:rFonts w:ascii="Times New Roman" w:hAnsi="Times New Roman" w:cs="Times New Roman"/>
+        </w:rPr>
+      </w:pPr>
+    </w:p>
+    <w:p>
+      <w:pPr>
+        <w:jc w:val="both"/>
+        <w:rPr>
+          <w:rFonts w:ascii="Times New Roman" w:hAnsi="Times New Roman" w:cs="Times New Roman"/>
+        </w:rPr>
+      </w:pPr>
+    </w:p>
+    <w:p>
+      <w:pPr>
+        <w:jc w:val="both"/>
+        <w:rPr>
+          <w:rFonts w:ascii="Times New Roman" w:hAnsi="Times New Roman" w:cs="Times New Roman"/>
+        </w:rPr>
+      </w:pPr>
+    </w:p>
+    <w:p>
+      <w:pPr>
+        <w:jc w:val="both"/>
+        <w:rPr>
+          <w:rFonts w:ascii="Times New Roman" w:hAnsi="Times New Roman" w:cs="Times New Roman"/>
+        </w:rPr>
+      </w:pPr>
+    </w:p>
+    <w:p>
+      <w:pPr>
+        <w:jc w:val="both"/>
+        <w:rPr>
+          <w:rFonts w:ascii="Times New Roman" w:hAnsi="Times New Roman" w:cs="Times New Roman"/>
+        </w:rPr>
+      </w:pPr>
+    </w:p>
+    <w:p>
+      <w:pPr>
+        <w:jc w:val="both"/>
+        <w:rPr>
+          <w:rFonts w:ascii="Times New Roman" w:hAnsi="Times New Roman" w:cs="Times New Roman"/>
+        </w:rPr>
+      </w:pPr>
+    </w:p>
+    <w:p>
+      <w:pPr>
+        <w:jc w:val="both"/>
+        <w:rPr>
+          <w:rFonts w:ascii="Times New Roman" w:hAnsi="Times New Roman" w:cs="Times New Roman"/>
+        </w:rPr>
+      </w:pPr>
+    </w:p>
+    <w:p>
+      <w:pPr>
+        <w:jc w:val="both"/>
+        <w:rPr>
+          <w:rFonts w:ascii="Times New Roman" w:hAnsi="Times New Roman" w:cs="Times New Roman"/>
+        </w:rPr>
+      </w:pPr>
+    </w:p>
+    <w:p>
+      <w:pPr>
+        <w:jc w:val="both"/>
+        <w:rPr>
+          <w:rFonts w:ascii="Times New Roman" w:hAnsi="Times New Roman" w:cs="Times New Roman"/>
+        </w:rPr>
+      </w:pPr>
+    </w:p>
+    <w:p>
+      <w:pPr>
+        <w:jc w:val="both"/>
+        <w:rPr>
+          <w:rFonts w:ascii="Times New Roman" w:hAnsi="Times New Roman" w:cs="Times New Roman"/>
+        </w:rPr>
+      </w:pPr>
+    </w:p>
+    <w:p>
+      <w:pPr>
+        <w:jc w:val="both"/>
+        <w:rPr>
+          <w:rFonts w:ascii="Times New Roman" w:hAnsi="Times New Roman" w:cs="Times New Roman"/>
+        </w:rPr>
+      </w:pPr>
+    </w:p>
+    <w:p>
+      <w:pPr>
+        <w:jc w:val="both"/>
+        <w:rPr>
+          <w:rFonts w:ascii="Times New Roman" w:hAnsi="Times New Roman" w:cs="Times New Roman"/>
+        </w:rPr>
+      </w:pPr>
+    </w:p>
+    <w:p>
+      <w:pPr>
+        <w:jc w:val="both"/>
+        <w:rPr>
+          <w:rFonts w:ascii="Times New Roman" w:hAnsi="Times New Roman" w:cs="Times New Roman"/>
+        </w:rPr>
+      </w:pPr>
+    </w:p>
+    <w:p>
+      <w:pPr>
+        <w:jc w:val="both"/>
+        <w:rPr>
+          <w:rFonts w:ascii="Times New Roman" w:hAnsi="Times New Roman" w:cs="Times New Roman"/>
+        </w:rPr>
+      </w:pPr>
+      <w:r>
+        <w:rPr>
+          <w:rFonts w:ascii="Times New Roman" w:hAnsi="Times New Roman" w:cs="Times New Roman"/>
+        </w:rPr>
+        <w:lastRenderedPageBreak/>
+        <w:t>Based on the above data, the average (real) time for</w:t>
+      </w:r>
+      <w:r>
+        <w:rPr>
+          <w:rFonts w:ascii="Times New Roman" w:hAnsi="Times New Roman" w:cs="Times New Roman"/>
+        </w:rPr>
+        <w:t xml:space="preserve"> </w:t>
+      </w:r>
+      <w:r>
+        <w:rPr>
+          <w:rFonts w:ascii="Times New Roman" w:hAnsi="Times New Roman" w:cs="Times New Roman"/>
+          <w:b/>
+          <w:bCs/>
+        </w:rPr>
+        <w:t>appserver</w:t>
+      </w:r>
+      <w:r>
+        <w:rPr>
+          <w:rFonts w:ascii="Times New Roman" w:hAnsi="Times New Roman" w:cs="Times New Roman"/>
+        </w:rPr>
+        <w:t xml:space="preserve"> is </w:t>
+      </w:r>
+      <w:r>
+        <w:rPr>
+          <w:rFonts w:ascii="Times New Roman" w:hAnsi="Times New Roman" w:cs="Times New Roman"/>
+        </w:rPr>
+        <w:t>55.923</w:t>
+      </w:r>
+      <w:r>
+        <w:rPr>
+          <w:rFonts w:ascii="Times New Roman" w:hAnsi="Times New Roman" w:cs="Times New Roman"/>
+        </w:rPr>
+        <w:t xml:space="preserve"> </w:t>
+      </w:r>
+      <w:r>
+        <w:rPr>
+          <w:rFonts w:ascii="Times New Roman" w:hAnsi="Times New Roman" w:cs="Times New Roman"/>
+        </w:rPr>
+        <w:t xml:space="preserve"> and </w:t>
+      </w:r>
+      <w:r>
+        <w:rPr>
+          <w:rFonts w:ascii="Times New Roman" w:hAnsi="Times New Roman" w:cs="Times New Roman"/>
+          <w:b/>
+          <w:bCs/>
+        </w:rPr>
+        <w:t>appserver-coarse</w:t>
+      </w:r>
+      <w:r>
+        <w:rPr>
+          <w:rFonts w:ascii="Times New Roman" w:hAnsi="Times New Roman" w:cs="Times New Roman"/>
+          <w:b/>
+          <w:bCs/>
+        </w:rPr>
+        <w:t xml:space="preserve"> </w:t>
+      </w:r>
+      <w:r>
+        <w:rPr>
+          <w:rFonts w:ascii="Times New Roman" w:hAnsi="Times New Roman" w:cs="Times New Roman"/>
+        </w:rPr>
+        <w:t xml:space="preserve">is </w:t>
+      </w:r>
+      <w:r>
+        <w:rPr>
+          <w:rFonts w:ascii="Times New Roman" w:hAnsi="Times New Roman" w:cs="Times New Roman"/>
+        </w:rPr>
+        <w:t>1m2.951</w:t>
+      </w:r>
+      <w:r>
+        <w:rPr>
+          <w:rFonts w:ascii="Times New Roman" w:hAnsi="Times New Roman" w:cs="Times New Roman"/>
+        </w:rPr>
+        <w:t>.</w:t>
+      </w:r>
     </w:p>
     <w:p>
       <w:pPr>
@@ -420,38 +1775,12 @@
           <w:rFonts w:ascii="Times New Roman" w:hAnsi="Times New Roman" w:cs="Times New Roman"/>
         </w:rPr>
       </w:pPr>
-    </w:p>
-    <w:p>
-      <w:pPr>
-        <w:jc w:val="both"/>
-        <w:rPr>
-          <w:rFonts w:ascii="Times New Roman" w:hAnsi="Times New Roman" w:cs="Times New Roman"/>
-        </w:rPr>
-      </w:pPr>
-    </w:p>
-    <w:p>
-      <w:pPr>
-        <w:jc w:val="both"/>
-        <w:rPr>
-          <w:rFonts w:ascii="Times New Roman" w:hAnsi="Times New Roman" w:cs="Times New Roman"/>
-        </w:rPr>
-      </w:pPr>
-    </w:p>
-    <w:p>
-      <w:pPr>
-        <w:jc w:val="both"/>
-        <w:rPr>
-          <w:rFonts w:ascii="Times New Roman" w:hAnsi="Times New Roman" w:cs="Times New Roman"/>
-        </w:rPr>
-      </w:pPr>
-    </w:p>
-    <w:p>
-      <w:pPr>
-        <w:jc w:val="both"/>
-        <w:rPr>
-          <w:rFonts w:ascii="Times New Roman" w:hAnsi="Times New Roman" w:cs="Times New Roman"/>
-        </w:rPr>
-      </w:pPr>
+      <w:r>
+        <w:rPr>
+          <w:rFonts w:ascii="Times New Roman" w:hAnsi="Times New Roman" w:cs="Times New Roman"/>
+        </w:rPr>
+        <w:t>The appserver was faster, this used the fine-grained locking technique.</w:t>
+      </w:r>
     </w:p>
     <w:p>
       <w:pPr>
@@ -481,7 +1810,6 @@
           <w:b/>
           <w:bCs/>
         </w:rPr>
-        <w:lastRenderedPageBreak/>
         <w:t>(3 pts) Why was this technique faster?</w:t>
       </w:r>
     </w:p>
@@ -500,46 +1828,12 @@
           <w:rFonts w:ascii="Times New Roman" w:hAnsi="Times New Roman" w:cs="Times New Roman"/>
         </w:rPr>
       </w:pPr>
-    </w:p>
-    <w:p>
-      <w:pPr>
-        <w:jc w:val="both"/>
-        <w:rPr>
-          <w:rFonts w:ascii="Times New Roman" w:hAnsi="Times New Roman" w:cs="Times New Roman"/>
-        </w:rPr>
-      </w:pPr>
-    </w:p>
-    <w:p>
-      <w:pPr>
-        <w:jc w:val="both"/>
-        <w:rPr>
-          <w:rFonts w:ascii="Times New Roman" w:hAnsi="Times New Roman" w:cs="Times New Roman"/>
-        </w:rPr>
-      </w:pPr>
-    </w:p>
-    <w:p>
-      <w:pPr>
-        <w:jc w:val="both"/>
-        <w:rPr>
-          <w:rFonts w:ascii="Times New Roman" w:hAnsi="Times New Roman" w:cs="Times New Roman"/>
-        </w:rPr>
-      </w:pPr>
-    </w:p>
-    <w:p>
-      <w:pPr>
-        <w:jc w:val="both"/>
-        <w:rPr>
-          <w:rFonts w:ascii="Times New Roman" w:hAnsi="Times New Roman" w:cs="Times New Roman"/>
-        </w:rPr>
-      </w:pPr>
-    </w:p>
-    <w:p>
-      <w:pPr>
-        <w:jc w:val="both"/>
-        <w:rPr>
-          <w:rFonts w:ascii="Times New Roman" w:hAnsi="Times New Roman" w:cs="Times New Roman"/>
-        </w:rPr>
-      </w:pPr>
+      <w:r>
+        <w:rPr>
+          <w:rFonts w:ascii="Times New Roman" w:hAnsi="Times New Roman" w:cs="Times New Roman"/>
+        </w:rPr>
+        <w:t>The fine-grained locking was faster because it allowed for parallelism when the transactions touched various different accounts. However, this also comes with more overhead as a downside.</w:t>
+      </w:r>
     </w:p>
     <w:p>
       <w:pPr>
@@ -587,54 +1881,12 @@
           <w:rFonts w:ascii="Times New Roman" w:hAnsi="Times New Roman" w:cs="Times New Roman"/>
         </w:rPr>
       </w:pPr>
-    </w:p>
-    <w:p>
-      <w:pPr>
-        <w:jc w:val="both"/>
-        <w:rPr>
-          <w:rFonts w:ascii="Times New Roman" w:hAnsi="Times New Roman" w:cs="Times New Roman"/>
-        </w:rPr>
-      </w:pPr>
-    </w:p>
-    <w:p>
-      <w:pPr>
-        <w:jc w:val="both"/>
-        <w:rPr>
-          <w:rFonts w:ascii="Times New Roman" w:hAnsi="Times New Roman" w:cs="Times New Roman"/>
-        </w:rPr>
-      </w:pPr>
-    </w:p>
-    <w:p>
-      <w:pPr>
-        <w:jc w:val="both"/>
-        <w:rPr>
-          <w:rFonts w:ascii="Times New Roman" w:hAnsi="Times New Roman" w:cs="Times New Roman"/>
-        </w:rPr>
-      </w:pPr>
-    </w:p>
-    <w:p>
-      <w:pPr>
-        <w:jc w:val="both"/>
-        <w:rPr>
-          <w:rFonts w:ascii="Times New Roman" w:hAnsi="Times New Roman" w:cs="Times New Roman"/>
-        </w:rPr>
-      </w:pPr>
-    </w:p>
-    <w:p>
-      <w:pPr>
-        <w:jc w:val="both"/>
-        <w:rPr>
-          <w:rFonts w:ascii="Times New Roman" w:hAnsi="Times New Roman" w:cs="Times New Roman"/>
-        </w:rPr>
-      </w:pPr>
-    </w:p>
-    <w:p>
-      <w:pPr>
-        <w:jc w:val="both"/>
-        <w:rPr>
-          <w:rFonts w:ascii="Times New Roman" w:hAnsi="Times New Roman" w:cs="Times New Roman"/>
-        </w:rPr>
-      </w:pPr>
+      <w:r>
+        <w:rPr>
+          <w:rFonts w:ascii="Times New Roman" w:hAnsi="Times New Roman" w:cs="Times New Roman"/>
+        </w:rPr>
+        <w:t>The coarse-grained locking technique could be faster in situations that involve transactions which are short, which would make using the mutex lock/unlock overhead significantly more taxing than just using a single lock. Additionally, since in our case, we have very few concurrent requests anyway, the overhead of having multiple individual mutexes outweighs the benefits we get from parallelism.</w:t>
+      </w:r>
     </w:p>
     <w:p>
       <w:pPr>
@@ -682,54 +1934,54 @@
           <w:rFonts w:ascii="Times New Roman" w:hAnsi="Times New Roman" w:cs="Times New Roman"/>
         </w:rPr>
       </w:pPr>
-    </w:p>
-    <w:p>
-      <w:pPr>
-        <w:jc w:val="both"/>
-        <w:rPr>
-          <w:rFonts w:ascii="Times New Roman" w:hAnsi="Times New Roman" w:cs="Times New Roman"/>
-        </w:rPr>
-      </w:pPr>
-    </w:p>
-    <w:p>
-      <w:pPr>
-        <w:jc w:val="both"/>
-        <w:rPr>
-          <w:rFonts w:ascii="Times New Roman" w:hAnsi="Times New Roman" w:cs="Times New Roman"/>
-        </w:rPr>
-      </w:pPr>
-    </w:p>
-    <w:p>
-      <w:pPr>
-        <w:jc w:val="both"/>
-        <w:rPr>
-          <w:rFonts w:ascii="Times New Roman" w:hAnsi="Times New Roman" w:cs="Times New Roman"/>
-        </w:rPr>
-      </w:pPr>
-    </w:p>
-    <w:p>
-      <w:pPr>
-        <w:jc w:val="both"/>
-        <w:rPr>
-          <w:rFonts w:ascii="Times New Roman" w:hAnsi="Times New Roman" w:cs="Times New Roman"/>
-        </w:rPr>
-      </w:pPr>
-    </w:p>
-    <w:p>
-      <w:pPr>
-        <w:jc w:val="both"/>
-        <w:rPr>
-          <w:rFonts w:ascii="Times New Roman" w:hAnsi="Times New Roman" w:cs="Times New Roman"/>
-        </w:rPr>
-      </w:pPr>
-    </w:p>
-    <w:p>
-      <w:pPr>
-        <w:jc w:val="both"/>
-        <w:rPr>
-          <w:rFonts w:ascii="Times New Roman" w:hAnsi="Times New Roman" w:cs="Times New Roman"/>
-        </w:rPr>
-      </w:pPr>
+      <w:r>
+        <w:rPr>
+          <w:rFonts w:ascii="Times New Roman" w:hAnsi="Times New Roman" w:cs="Times New Roman"/>
+        </w:rPr>
+        <w:t xml:space="preserve">Performance would most likely </w:t>
+      </w:r>
+      <w:r>
+        <w:rPr>
+          <w:rFonts w:ascii="Times New Roman" w:hAnsi="Times New Roman" w:cs="Times New Roman"/>
+        </w:rPr>
+        <w:t>sit in the middle</w:t>
+      </w:r>
+      <w:r>
+        <w:rPr>
+          <w:rFonts w:ascii="Times New Roman" w:hAnsi="Times New Roman" w:cs="Times New Roman"/>
+        </w:rPr>
+        <w:t xml:space="preserve"> </w:t>
+      </w:r>
+      <w:r>
+        <w:rPr>
+          <w:rFonts w:ascii="Times New Roman" w:hAnsi="Times New Roman" w:cs="Times New Roman"/>
+        </w:rPr>
+        <w:t>of</w:t>
+      </w:r>
+      <w:r>
+        <w:rPr>
+          <w:rFonts w:ascii="Times New Roman" w:hAnsi="Times New Roman" w:cs="Times New Roman"/>
+        </w:rPr>
+        <w:t xml:space="preserve"> our coarse-grained and fine-grained approaches </w:t>
+      </w:r>
+      <w:r>
+        <w:rPr>
+          <w:rFonts w:ascii="Times New Roman" w:hAnsi="Times New Roman" w:cs="Times New Roman"/>
+        </w:rPr>
+        <w:t>if a lock was used for every 10 accounts.</w:t>
+      </w:r>
+      <w:r>
+        <w:rPr>
+          <w:rFonts w:ascii="Times New Roman" w:hAnsi="Times New Roman" w:cs="Times New Roman"/>
+        </w:rPr>
+        <w:t xml:space="preserve"> This is because, using one lock for every 10 accounts is a form of medium-grained locking technique and would reduce our total number of mutexes from 1000</w:t>
+      </w:r>
+      <w:r>
+        <w:rPr>
+          <w:rFonts w:ascii="Times New Roman" w:hAnsi="Times New Roman" w:cs="Times New Roman"/>
+        </w:rPr>
+        <w:t xml:space="preserve"> to 100 which would reduce the overhead on memory, it would allow more parallelism than our coarse-grained approach but less than our fine-grained approach. If the answer needs to be better/worse performance then I am unsure because I think that theoretically the performance would sit in the middle of both our approaches.</w:t>
+      </w:r>
     </w:p>
     <w:p>
       <w:pPr>
@@ -759,37 +2011,120 @@
           <w:b/>
           <w:bCs/>
         </w:rPr>
-        <w:t xml:space="preserve">(3 pts) What is the optimal locking granularity (fine, </w:t>
-      </w:r>
-      <w:proofErr w:type="gramStart"/>
-      <w:r>
+        <w:t>(3 pts) What is the optimal locking granularity (fine, coarse or medium)?</w:t>
+      </w:r>
+    </w:p>
+    <w:p>
+      <w:pPr>
+        <w:ind w:left="360"/>
+        <w:jc w:val="both"/>
         <w:rPr>
           <w:rFonts w:ascii="Times New Roman" w:hAnsi="Times New Roman" w:cs="Times New Roman"/>
           <w:b/>
           <w:bCs/>
         </w:rPr>
-        <w:t>coarse</w:t>
-      </w:r>
-      <w:proofErr w:type="gramEnd"/>
-      <w:r>
-        <w:rPr>
-          <w:rFonts w:ascii="Times New Roman" w:hAnsi="Times New Roman" w:cs="Times New Roman"/>
-          <w:b/>
-          <w:bCs/>
-        </w:rPr>
-        <w:t xml:space="preserve"> or medium)?</w:t>
+      </w:pPr>
+    </w:p>
+    <w:p>
+      <w:pPr>
+        <w:jc w:val="both"/>
+        <w:rPr>
+          <w:rFonts w:ascii="Times New Roman" w:hAnsi="Times New Roman" w:cs="Times New Roman"/>
+        </w:rPr>
+      </w:pPr>
+      <w:r>
+        <w:rPr>
+          <w:rFonts w:ascii="Times New Roman" w:hAnsi="Times New Roman" w:cs="Times New Roman"/>
+        </w:rPr>
+        <w:t>I think the optimal locking granulatity depends on our workload. For example:</w:t>
       </w:r>
     </w:p>
     <w:p>
       <w:pPr>
         <w:pStyle w:val="ListParagraph"/>
-        <w:jc w:val="both"/>
-        <w:rPr>
-          <w:rFonts w:ascii="Times New Roman" w:hAnsi="Times New Roman" w:cs="Times New Roman"/>
-          <w:b/>
-          <w:bCs/>
-        </w:rPr>
-      </w:pPr>
+        <w:numPr>
+          <w:ilvl w:val="0"/>
+          <w:numId w:val="3"/>
+        </w:numPr>
+        <w:jc w:val="both"/>
+        <w:rPr>
+          <w:rFonts w:ascii="Times New Roman" w:hAnsi="Times New Roman" w:cs="Times New Roman"/>
+        </w:rPr>
+      </w:pPr>
+      <w:r>
+        <w:rPr>
+          <w:rFonts w:ascii="Times New Roman" w:hAnsi="Times New Roman" w:cs="Times New Roman"/>
+        </w:rPr>
+        <w:t xml:space="preserve">For </w:t>
+      </w:r>
+      <w:r>
+        <w:rPr>
+          <w:rFonts w:ascii="Times New Roman" w:hAnsi="Times New Roman" w:cs="Times New Roman"/>
+        </w:rPr>
+        <w:t xml:space="preserve">the </w:t>
+      </w:r>
+      <w:r>
+        <w:rPr>
+          <w:rFonts w:ascii="Times New Roman" w:hAnsi="Times New Roman" w:cs="Times New Roman"/>
+        </w:rPr>
+        <w:t>best parallelism</w:t>
+      </w:r>
+      <w:r>
+        <w:rPr>
+          <w:rFonts w:ascii="Times New Roman" w:hAnsi="Times New Roman" w:cs="Times New Roman"/>
+        </w:rPr>
+        <w:t xml:space="preserve"> but worst overhead</w:t>
+      </w:r>
+      <w:r>
+        <w:rPr>
+          <w:rFonts w:ascii="Times New Roman" w:hAnsi="Times New Roman" w:cs="Times New Roman"/>
+        </w:rPr>
+        <w:t xml:space="preserve">, we should use our fine-grained approach because this </w:t>
+      </w:r>
+      <w:r>
+        <w:rPr>
+          <w:rFonts w:ascii="Times New Roman" w:hAnsi="Times New Roman" w:cs="Times New Roman"/>
+        </w:rPr>
+        <w:t>is the best for situations and workloads with the highest level of concurrency. Basically it should be used in situations that involve various different accounts.</w:t>
+      </w:r>
+    </w:p>
+    <w:p>
+      <w:pPr>
+        <w:pStyle w:val="ListParagraph"/>
+        <w:numPr>
+          <w:ilvl w:val="0"/>
+          <w:numId w:val="3"/>
+        </w:numPr>
+        <w:jc w:val="both"/>
+        <w:rPr>
+          <w:rFonts w:ascii="Times New Roman" w:hAnsi="Times New Roman" w:cs="Times New Roman"/>
+        </w:rPr>
+      </w:pPr>
+      <w:r>
+        <w:rPr>
+          <w:rFonts w:ascii="Times New Roman" w:hAnsi="Times New Roman" w:cs="Times New Roman"/>
+        </w:rPr>
+        <w:t>For the least overhead but worst concurrency, we should use our coarse-grained approach because this is the best for situations and workloads with the lowest level of concurrency. Basically it should be used in situations that involve short and simple transactions with individual accounts.</w:t>
+      </w:r>
+    </w:p>
+    <w:p>
+      <w:pPr>
+        <w:pStyle w:val="ListParagraph"/>
+        <w:numPr>
+          <w:ilvl w:val="0"/>
+          <w:numId w:val="3"/>
+        </w:numPr>
+        <w:jc w:val="both"/>
+        <w:rPr>
+          <w:rFonts w:ascii="Times New Roman" w:hAnsi="Times New Roman" w:cs="Times New Roman"/>
+        </w:rPr>
+      </w:pPr>
+      <w:r>
+        <w:rPr>
+          <w:rFonts w:ascii="Times New Roman" w:hAnsi="Times New Roman" w:cs="Times New Roman"/>
+        </w:rPr>
+        <w:t>For the balanced cases, we should use our medium-grained approach because this sits in the middle of the first two. It reduces our overhead when compared to our fine-grained approach but also allows for a decent amount of concurrency over our coarse-grained approach.</w:t>
+      </w:r>
     </w:p>
     <w:sectPr>
       <w:pgSz w:w="12240" w:h="15840"/>
@@ -802,8 +2137,121 @@
 </file>
 
 <file path=word/numbering.xml><?xml version="1.0" encoding="utf-8"?>
-<w:numbering xmlns:wpc="http://schemas.microsoft.com/office/word/2010/wordprocessingCanvas" xmlns:cx="http://schemas.microsoft.com/office/drawing/2014/chartex" xmlns:cx1="http://schemas.microsoft.com/office/drawing/2015/9/8/chartex" xmlns:cx2="http://schemas.microsoft.com/office/drawing/2015/10/21/chartex" xmlns:cx3="http://schemas.microsoft.com/office/drawing/2016/5/9/chartex" xmlns:cx4="http://schemas.microsoft.com/office/drawing/2016/5/10/chartex" xmlns:cx5="http://schemas.microsoft.com/office/drawing/2016/5/11/chartex" xmlns:cx6="http://schemas.microsoft.com/office/drawing/2016/5/12/chartex" xmlns:cx7="http://schemas.microsoft.com/office/drawing/2016/5/13/chartex" xmlns:cx8="http://schemas.microsoft.com/office/drawing/2016/5/14/chartex" xmlns:mc="http://schemas.openxmlformats.org/markup-compatibility/2006" xmlns:aink="http://schemas.microsoft.com/office/drawing/2016/ink" xmlns:am3d="http://schemas.microsoft.com/office/drawing/2017/model3d" xmlns:o="urn:schemas-microsoft-com:office:office" xmlns:r="http://schemas.openxmlformats.org/officeDocument/2006/relationships" xmlns:m="http://schemas.openxmlformats.org/officeDocument/2006/math" xmlns:v="urn:schemas-microsoft-com:vml" xmlns:wp14="http://schemas.microsoft.com/office/word/2010/wordprocessingDrawing" xmlns:wp="http://schemas.openxmlformats.org/drawingml/2006/wordprocessingDrawing" xmlns:w10="urn:schemas-microsoft-com:office:word" xmlns:w="http://schemas.openxmlformats.org/wordprocessingml/2006/main" xmlns:w14="http://schemas.microsoft.com/office/word/2010/wordml" xmlns:w15="http://schemas.microsoft.com/office/word/2012/wordml" xmlns:w16cex="http://schemas.microsoft.com/office/word/2018/wordml/cex" xmlns:w16cid="http://schemas.microsoft.com/office/word/2016/wordml/cid" xmlns:w16="http://schemas.microsoft.com/office/word/2018/wordml" xmlns:w16sdtdh="http://schemas.microsoft.com/office/word/2020/wordml/sdtdatahash" xmlns:w16se="http://schemas.microsoft.com/office/word/2015/wordml/symex" xmlns:wpg="http://schemas.microsoft.com/office/word/2010/wordprocessingGroup" xmlns:wpi="http://schemas.microsoft.com/office/word/2010/wordprocessingInk" xmlns:wne="http://schemas.microsoft.com/office/word/2006/wordml" xmlns:wps="http://schemas.microsoft.com/office/word/2010/wordprocessingShape" mc:Ignorable="w14 w15 w16se w16cid w16 w16cex w16sdtdh wp14">
+<w:numbering xmlns:wpc="http://schemas.microsoft.com/office/word/2010/wordprocessingCanvas" xmlns:cx="http://schemas.microsoft.com/office/drawing/2014/chartex" xmlns:cx1="http://schemas.microsoft.com/office/drawing/2015/9/8/chartex" xmlns:cx2="http://schemas.microsoft.com/office/drawing/2015/10/21/chartex" xmlns:cx3="http://schemas.microsoft.com/office/drawing/2016/5/9/chartex" xmlns:cx4="http://schemas.microsoft.com/office/drawing/2016/5/10/chartex" xmlns:cx5="http://schemas.microsoft.com/office/drawing/2016/5/11/chartex" xmlns:cx6="http://schemas.microsoft.com/office/drawing/2016/5/12/chartex" xmlns:cx7="http://schemas.microsoft.com/office/drawing/2016/5/13/chartex" xmlns:cx8="http://schemas.microsoft.com/office/drawing/2016/5/14/chartex" xmlns:mc="http://schemas.openxmlformats.org/markup-compatibility/2006" xmlns:aink="http://schemas.microsoft.com/office/drawing/2016/ink" xmlns:am3d="http://schemas.microsoft.com/office/drawing/2017/model3d" xmlns:o="urn:schemas-microsoft-com:office:office" xmlns:oel="http://schemas.microsoft.com/office/2019/extlst" xmlns:r="http://schemas.openxmlformats.org/officeDocument/2006/relationships" xmlns:m="http://schemas.openxmlformats.org/officeDocument/2006/math" xmlns:v="urn:schemas-microsoft-com:vml" xmlns:wp14="http://schemas.microsoft.com/office/word/2010/wordprocessingDrawing" xmlns:wp="http://schemas.openxmlformats.org/drawingml/2006/wordprocessingDrawing" xmlns:w10="urn:schemas-microsoft-com:office:word" xmlns:w="http://schemas.openxmlformats.org/wordprocessingml/2006/main" xmlns:w14="http://schemas.microsoft.com/office/word/2010/wordml" xmlns:w15="http://schemas.microsoft.com/office/word/2012/wordml" xmlns:w16cex="http://schemas.microsoft.com/office/word/2018/wordml/cex" xmlns:w16cid="http://schemas.microsoft.com/office/word/2016/wordml/cid" xmlns:w16="http://schemas.microsoft.com/office/word/2018/wordml" xmlns:w16du="http://schemas.microsoft.com/office/word/2023/wordml/word16du" xmlns:w16sdtdh="http://schemas.microsoft.com/office/word/2020/wordml/sdtdatahash" xmlns:w16sdtfl="http://schemas.microsoft.com/office/word/2024/wordml/sdtformatlock" xmlns:w16se="http://schemas.microsoft.com/office/word/2015/wordml/symex" xmlns:wpg="http://schemas.microsoft.com/office/word/2010/wordprocessingGroup" xmlns:wpi="http://schemas.microsoft.com/office/word/2010/wordprocessingInk" xmlns:wne="http://schemas.microsoft.com/office/word/2006/wordml" xmlns:wps="http://schemas.microsoft.com/office/word/2010/wordprocessingShape" mc:Ignorable="w14 w15 w16se w16cid w16 w16cex w16sdtdh w16sdtfl w16du wp14">
   <w:abstractNum w:abstractNumId="0" w15:restartNumberingAfterBreak="0">
+    <w:nsid w:val="01193B6C"/>
+    <w:multiLevelType w:val="hybridMultilevel"/>
+    <w:tmpl w:val="044294E4"/>
+    <w:lvl w:ilvl="0" w:tplc="89AAC624">
+      <w:start w:val="6"/>
+      <w:numFmt w:val="bullet"/>
+      <w:lvlText w:val="-"/>
+      <w:lvlJc w:val="left"/>
+      <w:pPr>
+        <w:ind w:left="720" w:hanging="360"/>
+      </w:pPr>
+      <w:rPr>
+        <w:rFonts w:ascii="Times New Roman" w:eastAsiaTheme="minorHAnsi" w:hAnsi="Times New Roman" w:cs="Times New Roman" w:hint="default"/>
+      </w:rPr>
+    </w:lvl>
+    <w:lvl w:ilvl="1" w:tplc="04090003" w:tentative="1">
+      <w:start w:val="1"/>
+      <w:numFmt w:val="bullet"/>
+      <w:lvlText w:val="o"/>
+      <w:lvlJc w:val="left"/>
+      <w:pPr>
+        <w:ind w:left="1440" w:hanging="360"/>
+      </w:pPr>
+      <w:rPr>
+        <w:rFonts w:ascii="Courier New" w:hAnsi="Courier New" w:hint="default"/>
+      </w:rPr>
+    </w:lvl>
+    <w:lvl w:ilvl="2" w:tplc="04090005" w:tentative="1">
+      <w:start w:val="1"/>
+      <w:numFmt w:val="bullet"/>
+      <w:lvlText w:val=""/>
+      <w:lvlJc w:val="left"/>
+      <w:pPr>
+        <w:ind w:left="2160" w:hanging="360"/>
+      </w:pPr>
+      <w:rPr>
+        <w:rFonts w:ascii="Wingdings" w:hAnsi="Wingdings" w:hint="default"/>
+      </w:rPr>
+    </w:lvl>
+    <w:lvl w:ilvl="3" w:tplc="04090001" w:tentative="1">
+      <w:start w:val="1"/>
+      <w:numFmt w:val="bullet"/>
+      <w:lvlText w:val=""/>
+      <w:lvlJc w:val="left"/>
+      <w:pPr>
+        <w:ind w:left="2880" w:hanging="360"/>
+      </w:pPr>
+      <w:rPr>
+        <w:rFonts w:ascii="Symbol" w:hAnsi="Symbol" w:hint="default"/>
+      </w:rPr>
+    </w:lvl>
+    <w:lvl w:ilvl="4" w:tplc="04090003" w:tentative="1">
+      <w:start w:val="1"/>
+      <w:numFmt w:val="bullet"/>
+      <w:lvlText w:val="o"/>
+      <w:lvlJc w:val="left"/>
+      <w:pPr>
+        <w:ind w:left="3600" w:hanging="360"/>
+      </w:pPr>
+      <w:rPr>
+        <w:rFonts w:ascii="Courier New" w:hAnsi="Courier New" w:hint="default"/>
+      </w:rPr>
+    </w:lvl>
+    <w:lvl w:ilvl="5" w:tplc="04090005" w:tentative="1">
+      <w:start w:val="1"/>
+      <w:numFmt w:val="bullet"/>
+      <w:lvlText w:val=""/>
+      <w:lvlJc w:val="left"/>
+      <w:pPr>
+        <w:ind w:left="4320" w:hanging="360"/>
+      </w:pPr>
+      <w:rPr>
+        <w:rFonts w:ascii="Wingdings" w:hAnsi="Wingdings" w:hint="default"/>
+      </w:rPr>
+    </w:lvl>
+    <w:lvl w:ilvl="6" w:tplc="04090001" w:tentative="1">
+      <w:start w:val="1"/>
+      <w:numFmt w:val="bullet"/>
+      <w:lvlText w:val=""/>
+      <w:lvlJc w:val="left"/>
+      <w:pPr>
+        <w:ind w:left="5040" w:hanging="360"/>
+      </w:pPr>
+      <w:rPr>
+        <w:rFonts w:ascii="Symbol" w:hAnsi="Symbol" w:hint="default"/>
+      </w:rPr>
+    </w:lvl>
+    <w:lvl w:ilvl="7" w:tplc="04090003" w:tentative="1">
+      <w:start w:val="1"/>
+      <w:numFmt w:val="bullet"/>
+      <w:lvlText w:val="o"/>
+      <w:lvlJc w:val="left"/>
+      <w:pPr>
+        <w:ind w:left="5760" w:hanging="360"/>
+      </w:pPr>
+      <w:rPr>
+        <w:rFonts w:ascii="Courier New" w:hAnsi="Courier New" w:hint="default"/>
+      </w:rPr>
+    </w:lvl>
+    <w:lvl w:ilvl="8" w:tplc="04090005" w:tentative="1">
+      <w:start w:val="1"/>
+      <w:numFmt w:val="bullet"/>
+      <w:lvlText w:val=""/>
+      <w:lvlJc w:val="left"/>
+      <w:pPr>
+        <w:ind w:left="6480" w:hanging="360"/>
+      </w:pPr>
+      <w:rPr>
+        <w:rFonts w:ascii="Wingdings" w:hAnsi="Wingdings" w:hint="default"/>
+      </w:rPr>
+    </w:lvl>
+  </w:abstractNum>
+  <w:abstractNum w:abstractNumId="1" w15:restartNumberingAfterBreak="0">
     <w:nsid w:val="53F81A60"/>
     <w:multiLevelType w:val="hybridMultilevel"/>
     <w:tmpl w:val="203CF922"/>
@@ -893,14 +2341,169 @@
       </w:pPr>
     </w:lvl>
   </w:abstractNum>
-  <w:num w:numId="1">
+  <w:abstractNum w:abstractNumId="2" w15:restartNumberingAfterBreak="0">
+    <w:nsid w:val="63E47234"/>
+    <w:multiLevelType w:val="multilevel"/>
+    <w:tmpl w:val="0D747E30"/>
+    <w:lvl w:ilvl="0">
+      <w:start w:val="1"/>
+      <w:numFmt w:val="bullet"/>
+      <w:lvlText w:val=""/>
+      <w:lvlJc w:val="left"/>
+      <w:pPr>
+        <w:tabs>
+          <w:tab w:val="num" w:pos="720"/>
+        </w:tabs>
+        <w:ind w:left="720" w:hanging="360"/>
+      </w:pPr>
+      <w:rPr>
+        <w:rFonts w:ascii="Symbol" w:hAnsi="Symbol" w:hint="default"/>
+        <w:sz w:val="20"/>
+      </w:rPr>
+    </w:lvl>
+    <w:lvl w:ilvl="1" w:tentative="1">
+      <w:start w:val="1"/>
+      <w:numFmt w:val="bullet"/>
+      <w:lvlText w:val="o"/>
+      <w:lvlJc w:val="left"/>
+      <w:pPr>
+        <w:tabs>
+          <w:tab w:val="num" w:pos="1440"/>
+        </w:tabs>
+        <w:ind w:left="1440" w:hanging="360"/>
+      </w:pPr>
+      <w:rPr>
+        <w:rFonts w:ascii="Courier New" w:hAnsi="Courier New" w:hint="default"/>
+        <w:sz w:val="20"/>
+      </w:rPr>
+    </w:lvl>
+    <w:lvl w:ilvl="2" w:tentative="1">
+      <w:start w:val="1"/>
+      <w:numFmt w:val="bullet"/>
+      <w:lvlText w:val=""/>
+      <w:lvlJc w:val="left"/>
+      <w:pPr>
+        <w:tabs>
+          <w:tab w:val="num" w:pos="2160"/>
+        </w:tabs>
+        <w:ind w:left="2160" w:hanging="360"/>
+      </w:pPr>
+      <w:rPr>
+        <w:rFonts w:ascii="Wingdings" w:hAnsi="Wingdings" w:hint="default"/>
+        <w:sz w:val="20"/>
+      </w:rPr>
+    </w:lvl>
+    <w:lvl w:ilvl="3" w:tentative="1">
+      <w:start w:val="1"/>
+      <w:numFmt w:val="bullet"/>
+      <w:lvlText w:val=""/>
+      <w:lvlJc w:val="left"/>
+      <w:pPr>
+        <w:tabs>
+          <w:tab w:val="num" w:pos="2880"/>
+        </w:tabs>
+        <w:ind w:left="2880" w:hanging="360"/>
+      </w:pPr>
+      <w:rPr>
+        <w:rFonts w:ascii="Wingdings" w:hAnsi="Wingdings" w:hint="default"/>
+        <w:sz w:val="20"/>
+      </w:rPr>
+    </w:lvl>
+    <w:lvl w:ilvl="4" w:tentative="1">
+      <w:start w:val="1"/>
+      <w:numFmt w:val="bullet"/>
+      <w:lvlText w:val=""/>
+      <w:lvlJc w:val="left"/>
+      <w:pPr>
+        <w:tabs>
+          <w:tab w:val="num" w:pos="3600"/>
+        </w:tabs>
+        <w:ind w:left="3600" w:hanging="360"/>
+      </w:pPr>
+      <w:rPr>
+        <w:rFonts w:ascii="Wingdings" w:hAnsi="Wingdings" w:hint="default"/>
+        <w:sz w:val="20"/>
+      </w:rPr>
+    </w:lvl>
+    <w:lvl w:ilvl="5" w:tentative="1">
+      <w:start w:val="1"/>
+      <w:numFmt w:val="bullet"/>
+      <w:lvlText w:val=""/>
+      <w:lvlJc w:val="left"/>
+      <w:pPr>
+        <w:tabs>
+          <w:tab w:val="num" w:pos="4320"/>
+        </w:tabs>
+        <w:ind w:left="4320" w:hanging="360"/>
+      </w:pPr>
+      <w:rPr>
+        <w:rFonts w:ascii="Wingdings" w:hAnsi="Wingdings" w:hint="default"/>
+        <w:sz w:val="20"/>
+      </w:rPr>
+    </w:lvl>
+    <w:lvl w:ilvl="6" w:tentative="1">
+      <w:start w:val="1"/>
+      <w:numFmt w:val="bullet"/>
+      <w:lvlText w:val=""/>
+      <w:lvlJc w:val="left"/>
+      <w:pPr>
+        <w:tabs>
+          <w:tab w:val="num" w:pos="5040"/>
+        </w:tabs>
+        <w:ind w:left="5040" w:hanging="360"/>
+      </w:pPr>
+      <w:rPr>
+        <w:rFonts w:ascii="Wingdings" w:hAnsi="Wingdings" w:hint="default"/>
+        <w:sz w:val="20"/>
+      </w:rPr>
+    </w:lvl>
+    <w:lvl w:ilvl="7" w:tentative="1">
+      <w:start w:val="1"/>
+      <w:numFmt w:val="bullet"/>
+      <w:lvlText w:val=""/>
+      <w:lvlJc w:val="left"/>
+      <w:pPr>
+        <w:tabs>
+          <w:tab w:val="num" w:pos="5760"/>
+        </w:tabs>
+        <w:ind w:left="5760" w:hanging="360"/>
+      </w:pPr>
+      <w:rPr>
+        <w:rFonts w:ascii="Wingdings" w:hAnsi="Wingdings" w:hint="default"/>
+        <w:sz w:val="20"/>
+      </w:rPr>
+    </w:lvl>
+    <w:lvl w:ilvl="8" w:tentative="1">
+      <w:start w:val="1"/>
+      <w:numFmt w:val="bullet"/>
+      <w:lvlText w:val=""/>
+      <w:lvlJc w:val="left"/>
+      <w:pPr>
+        <w:tabs>
+          <w:tab w:val="num" w:pos="6480"/>
+        </w:tabs>
+        <w:ind w:left="6480" w:hanging="360"/>
+      </w:pPr>
+      <w:rPr>
+        <w:rFonts w:ascii="Wingdings" w:hAnsi="Wingdings" w:hint="default"/>
+        <w:sz w:val="20"/>
+      </w:rPr>
+    </w:lvl>
+  </w:abstractNum>
+  <w:num w:numId="1" w16cid:durableId="1335256707">
+    <w:abstractNumId w:val="1"/>
+  </w:num>
+  <w:num w:numId="2" w16cid:durableId="1117213260">
+    <w:abstractNumId w:val="2"/>
+  </w:num>
+  <w:num w:numId="3" w16cid:durableId="550701377">
     <w:abstractNumId w:val="0"/>
   </w:num>
 </w:numbering>
 </file>
 
 <file path=word/styles.xml><?xml version="1.0" encoding="utf-8"?>
-<w:styles xmlns:mc="http://schemas.openxmlformats.org/markup-compatibility/2006" xmlns:r="http://schemas.openxmlformats.org/officeDocument/2006/relationships" xmlns:w="http://schemas.openxmlformats.org/wordprocessingml/2006/main" xmlns:w14="http://schemas.microsoft.com/office/word/2010/wordml" xmlns:w15="http://schemas.microsoft.com/office/word/2012/wordml" xmlns:w16cex="http://schemas.microsoft.com/office/word/2018/wordml/cex" xmlns:w16cid="http://schemas.microsoft.com/office/word/2016/wordml/cid" xmlns:w16="http://schemas.microsoft.com/office/word/2018/wordml" xmlns:w16sdtdh="http://schemas.microsoft.com/office/word/2020/wordml/sdtdatahash" xmlns:w16se="http://schemas.microsoft.com/office/word/2015/wordml/symex" mc:Ignorable="w14 w15 w16se w16cid w16 w16cex w16sdtdh">
+<w:styles xmlns:mc="http://schemas.openxmlformats.org/markup-compatibility/2006" xmlns:r="http://schemas.openxmlformats.org/officeDocument/2006/relationships" xmlns:w="http://schemas.openxmlformats.org/wordprocessingml/2006/main" xmlns:w14="http://schemas.microsoft.com/office/word/2010/wordml" xmlns:w15="http://schemas.microsoft.com/office/word/2012/wordml" xmlns:w16cex="http://schemas.microsoft.com/office/word/2018/wordml/cex" xmlns:w16cid="http://schemas.microsoft.com/office/word/2016/wordml/cid" xmlns:w16="http://schemas.microsoft.com/office/word/2018/wordml" xmlns:w16du="http://schemas.microsoft.com/office/word/2023/wordml/word16du" xmlns:w16sdtdh="http://schemas.microsoft.com/office/word/2020/wordml/sdtdatahash" xmlns:w16sdtfl="http://schemas.microsoft.com/office/word/2024/wordml/sdtformatlock" xmlns:w16se="http://schemas.microsoft.com/office/word/2015/wordml/symex" mc:Ignorable="w14 w15 w16se w16cid w16 w16cex w16sdtdh w16sdtfl w16du">
   <w:docDefaults>
     <w:rPrDefault>
       <w:rPr>
@@ -1329,6 +2932,17 @@
       <w:contextualSpacing/>
     </w:pPr>
   </w:style>
+  <w:style w:type="paragraph" w:customStyle="1" w:styleId="whitespace-normal">
+    <w:name w:val="whitespace-normal"/>
+    <w:basedOn w:val="Normal"/>
+    <w:rsid w:val="003B265A"/>
+    <w:pPr>
+      <w:spacing w:before="100" w:beforeAutospacing="1" w:after="100" w:afterAutospacing="1"/>
+    </w:pPr>
+    <w:rPr>
+      <w:rFonts w:ascii="Times New Roman" w:eastAsia="Times New Roman" w:hAnsi="Times New Roman" w:cs="Times New Roman"/>
+    </w:rPr>
+  </w:style>
 </w:styles>
 </file>
 

</xml_diff>